<commit_message>
Update documentation for this project
</commit_message>
<xml_diff>
--- a/Documentation/IT355-P01-AleksandraMarković6305.docx
+++ b/Documentation/IT355-P01-AleksandraMarković6305.docx
@@ -50,12 +50,12 @@
           <wp:inline distB="114300" distT="114300" distL="114300" distR="114300">
             <wp:extent cx="2425700" cy="1968500"/>
             <wp:effectExtent b="0" l="0" r="0" t="0"/>
-            <wp:docPr descr="Description: LOGO_bela_pozadina" id="1" name="image1.png"/>
+            <wp:docPr descr="Description: LOGO_bela_pozadina" id="18" name="image8.png"/>
             <a:graphic>
               <a:graphicData uri="http://schemas.openxmlformats.org/drawingml/2006/picture">
                 <pic:pic>
                   <pic:nvPicPr>
-                    <pic:cNvPr descr="Description: LOGO_bela_pozadina" id="0" name="image1.png"/>
+                    <pic:cNvPr descr="Description: LOGO_bela_pozadina" id="0" name="image8.png"/>
                     <pic:cNvPicPr preferRelativeResize="0"/>
                   </pic:nvPicPr>
                   <pic:blipFill>
@@ -685,7 +685,7 @@
         <w:pStyle w:val="Heading1"/>
         <w:numPr>
           <w:ilvl w:val="0"/>
-          <w:numId w:val="2"/>
+          <w:numId w:val="8"/>
         </w:numPr>
         <w:pBdr>
           <w:top w:color="auto" w:space="0" w:sz="0" w:val="none"/>
@@ -726,7 +726,18 @@
           <w:rFonts w:ascii="Times New Roman" w:cs="Times New Roman" w:eastAsia="Times New Roman" w:hAnsi="Times New Roman"/>
           <w:rtl w:val="0"/>
         </w:rPr>
-        <w:t xml:space="preserve">Event Hub je web aplikacija namenjena korisnicima koji žele da organizuju i promovišu događaje, kao i da pronađu i učestvuju u događajima drugih korisnika. Pomoću ove platforme moguće je kreirati, pregledati, izmeniti i obrisati događaje, kao i prijaviti se na već postojeće događaje. Na ovaj način omogućeno je okupljanje korisnika sa sličnim interesovanjima u oblastima muzike, filma, umetnosti, sporta i drugih hobija. Registracija nije obavezna, te korisnici mogu odmah pristupiti listi dostupnih događaja, kao i dodavati nove događaje bez prethodnog kreiranja naloga, čime se pojednostavljuje korišćenje aplikacije.</w:t>
+        <w:t xml:space="preserve">Event Hub je web aplikacija namenjena korisnicima koji žele da organizuju i promovišu događaje, kao i da pronađu i učestvuju u događajima drugih korisnika. Pomoću ove platforme moguće je kreirati, pregledati, izmeniti i obrisati događaje, kao i prijaviti se na već postojeće događaje. Na ovaj način omogućeno je okupljanje korisnika sa sličnim interesovanjima u oblastima muzike, filma, umetnosti, sporta i drugih hobija. </w:t>
+      </w:r>
+      <w:r>
+        <w:rPr>
+          <w:rtl w:val="0"/>
+        </w:rPr>
+        <w:t xml:space="preserve">Za kreiranje naloga potrebna su samo dva podatka, a to su korisnikovo ime i njegova mejl adresa, pa se na ovaj način pojednostavljuje korišćenje aplikacije i korisniku omogućava što brži pristup glavnim funkcionalnostima sistema.</w:t>
+      </w:r>
+      <w:r>
+        <w:rPr>
+          <w:rtl w:val="0"/>
+        </w:rPr>
       </w:r>
     </w:p>
     <w:p>
@@ -785,7 +796,7 @@
         <w:pStyle w:val="Heading1"/>
         <w:numPr>
           <w:ilvl w:val="0"/>
-          <w:numId w:val="2"/>
+          <w:numId w:val="8"/>
         </w:numPr>
         <w:rPr>
           <w:rFonts w:ascii="Times New Roman" w:cs="Times New Roman" w:eastAsia="Times New Roman" w:hAnsi="Times New Roman"/>
@@ -832,6 +843,7 @@
     <w:p>
       <w:pPr>
         <w:spacing w:after="240" w:before="240" w:lineRule="auto"/>
+        <w:jc w:val="both"/>
         <w:rPr/>
       </w:pPr>
       <w:r>
@@ -847,8 +859,9 @@
           <w:ilvl w:val="0"/>
           <w:numId w:val="1"/>
         </w:numPr>
-        <w:spacing w:after="0" w:afterAutospacing="0" w:before="240" w:lineRule="auto"/>
+        <w:spacing w:after="240" w:before="240" w:lineRule="auto"/>
         <w:ind w:left="720" w:hanging="360"/>
+        <w:jc w:val="both"/>
       </w:pPr>
       <w:r>
         <w:rPr>
@@ -863,8 +876,9 @@
           <w:ilvl w:val="0"/>
           <w:numId w:val="1"/>
         </w:numPr>
-        <w:spacing w:after="0" w:afterAutospacing="0" w:before="0" w:beforeAutospacing="0" w:lineRule="auto"/>
+        <w:spacing w:after="240" w:before="240" w:lineRule="auto"/>
         <w:ind w:left="720" w:hanging="360"/>
+        <w:jc w:val="both"/>
       </w:pPr>
       <w:r>
         <w:rPr>
@@ -879,8 +893,9 @@
           <w:ilvl w:val="0"/>
           <w:numId w:val="1"/>
         </w:numPr>
-        <w:spacing w:after="0" w:afterAutospacing="0" w:before="0" w:beforeAutospacing="0" w:lineRule="auto"/>
+        <w:spacing w:after="240" w:before="240" w:lineRule="auto"/>
         <w:ind w:left="720" w:hanging="360"/>
+        <w:jc w:val="both"/>
       </w:pPr>
       <w:r>
         <w:rPr>
@@ -895,8 +910,9 @@
           <w:ilvl w:val="0"/>
           <w:numId w:val="1"/>
         </w:numPr>
-        <w:spacing w:after="240" w:before="0" w:beforeAutospacing="0" w:lineRule="auto"/>
+        <w:spacing w:after="240" w:before="240" w:lineRule="auto"/>
         <w:ind w:left="720" w:hanging="360"/>
+        <w:jc w:val="both"/>
       </w:pPr>
       <w:r>
         <w:rPr>
@@ -927,14 +943,14 @@
         <w:rPr/>
         <w:drawing>
           <wp:inline distB="114300" distT="114300" distL="114300" distR="114300">
-            <wp:extent cx="5934918" cy="3788245"/>
+            <wp:extent cx="5670550" cy="3622599"/>
             <wp:effectExtent b="0" l="0" r="0" t="0"/>
-            <wp:docPr id="2" name="image2.png"/>
+            <wp:docPr id="12" name="image6.png"/>
             <a:graphic>
               <a:graphicData uri="http://schemas.openxmlformats.org/drawingml/2006/picture">
                 <pic:pic>
                   <pic:nvPicPr>
-                    <pic:cNvPr id="0" name="image2.png"/>
+                    <pic:cNvPr id="0" name="image6.png"/>
                     <pic:cNvPicPr preferRelativeResize="0"/>
                   </pic:nvPicPr>
                   <pic:blipFill>
@@ -947,7 +963,7 @@
                   <pic:spPr>
                     <a:xfrm>
                       <a:off x="0" y="0"/>
-                      <a:ext cx="5934918" cy="3788245"/>
+                      <a:ext cx="5670550" cy="3622599"/>
                     </a:xfrm>
                     <a:prstGeom prst="rect"/>
                     <a:ln/>
@@ -967,26 +983,6 @@
     <w:p>
       <w:pPr>
         <w:jc w:val="center"/>
-        <w:rPr>
-          <w:i w:val="1"/>
-          <w:iCs w:val="1"/>
-          <w:sz w:val="18"/>
-          <w:szCs w:val="18"/>
-        </w:rPr>
-      </w:pPr>
-      <w:r>
-        <w:rPr>
-          <w:i w:val="1"/>
-          <w:iCs w:val="1"/>
-          <w:sz w:val="18"/>
-          <w:szCs w:val="18"/>
-          <w:rtl w:val="0"/>
-        </w:rPr>
-        <w:t xml:space="preserve">Slika 1 - Use case dijagram</w:t>
-      </w:r>
-    </w:p>
-    <w:p>
-      <w:pPr>
         <w:rPr/>
         <w:sectPr>
           <w:type w:val="nextPage"/>
@@ -996,6 +992,16 @@
       </w:pPr>
       <w:r>
         <w:rPr>
+          <w:i w:val="1"/>
+          <w:iCs w:val="1"/>
+          <w:sz w:val="18"/>
+          <w:szCs w:val="18"/>
+          <w:rtl w:val="0"/>
+        </w:rPr>
+        <w:t xml:space="preserve">Slika 1 - Use case dijagram</w:t>
+      </w:r>
+      <w:r>
+        <w:rPr>
           <w:rtl w:val="0"/>
         </w:rPr>
       </w:r>
@@ -1038,6 +1044,2614 @@
         </w:rPr>
         <w:t xml:space="preserve">Na dijagramu su sve funkcionalnosti predstavljene kao pojedinačni slučajevi korišćenja povezani sa akterom, čime je jasno prikazano koje akcije korisnik može izvršavati unutar sistema.</w:t>
       </w:r>
+    </w:p>
+    <w:p>
+      <w:pPr>
+        <w:spacing w:after="240" w:before="240" w:lineRule="auto"/>
+        <w:jc w:val="both"/>
+        <w:rPr/>
+        <w:sectPr>
+          <w:type w:val="nextPage"/>
+          <w:pgSz w:h="16834" w:w="11909" w:orient="portrait"/>
+          <w:pgMar w:bottom="1440" w:top="1440" w:left="1440" w:right="1440" w:header="720" w:footer="720"/>
+        </w:sectPr>
+      </w:pPr>
+      <w:r>
+        <w:rPr>
+          <w:rtl w:val="0"/>
+        </w:rPr>
+      </w:r>
+    </w:p>
+    <w:p>
+      <w:pPr>
+        <w:pStyle w:val="Heading1"/>
+        <w:numPr>
+          <w:ilvl w:val="0"/>
+          <w:numId w:val="8"/>
+        </w:numPr>
+        <w:spacing w:after="240" w:before="240" w:lineRule="auto"/>
+        <w:jc w:val="both"/>
+        <w:rPr>
+          <w:u w:val="none"/>
+        </w:rPr>
+      </w:pPr>
+      <w:bookmarkStart w:colFirst="0" w:colLast="0" w:name="_z3e8lbmd54qv" w:id="4"/>
+      <w:bookmarkEnd w:id="4"/>
+      <w:r>
+        <w:rPr>
+          <w:rtl w:val="0"/>
+        </w:rPr>
+        <w:t xml:space="preserve">Razvoj korisničkog interfejsa</w:t>
+      </w:r>
+    </w:p>
+    <w:p>
+      <w:pPr>
+        <w:jc w:val="both"/>
+        <w:rPr/>
+      </w:pPr>
+      <w:r>
+        <w:rPr>
+          <w:rtl w:val="0"/>
+        </w:rPr>
+        <w:t xml:space="preserve">Korisnički interfejs ove aplikacije razvijen je kao server-side renderisana web aplikacija korišćenjem Spring Boot okruženja i Thymeleaf template engine-a. UI sloj je odvojen od poslovne logike (Service sloj) i kontrolera (Controller sloj), čime je postignuta jasna MVC arhitektura. </w:t>
+      </w:r>
+    </w:p>
+    <w:p>
+      <w:pPr>
+        <w:spacing w:before="200" w:line="276" w:lineRule="auto"/>
+        <w:jc w:val="both"/>
+        <w:rPr/>
+      </w:pPr>
+      <w:r>
+        <w:rPr>
+          <w:rtl w:val="0"/>
+        </w:rPr>
+        <w:t xml:space="preserve">Za izradu interfejsa korišćeni su HTML5 i CSS3, dok je Thymeleaf korišćen za dinamičko prikazivanje podataka koji dolaze iz backend-a. Podaci se iz kontrolera prosleđuju u view kroz </w:t>
+      </w:r>
+      <w:r>
+        <w:rPr>
+          <w:rtl w:val="0"/>
+        </w:rPr>
+        <w:t xml:space="preserve">Model</w:t>
+      </w:r>
+      <w:r>
+        <w:rPr>
+          <w:rtl w:val="0"/>
+        </w:rPr>
+        <w:t xml:space="preserve"> objekat, a zatim se renderuju u HTML stranicama pomoću Thymeleaf izraza (npr. </w:t>
+      </w:r>
+      <w:r>
+        <w:rPr>
+          <w:rtl w:val="0"/>
+        </w:rPr>
+        <w:t xml:space="preserve">th:text</w:t>
+      </w:r>
+      <w:r>
+        <w:rPr>
+          <w:rtl w:val="0"/>
+        </w:rPr>
+        <w:t xml:space="preserve">, </w:t>
+      </w:r>
+      <w:r>
+        <w:rPr>
+          <w:rtl w:val="0"/>
+        </w:rPr>
+        <w:t xml:space="preserve">th:each</w:t>
+      </w:r>
+      <w:r>
+        <w:rPr>
+          <w:rtl w:val="0"/>
+        </w:rPr>
+        <w:t xml:space="preserve">, </w:t>
+      </w:r>
+      <w:r>
+        <w:rPr>
+          <w:rtl w:val="0"/>
+        </w:rPr>
+        <w:t xml:space="preserve">th:if</w:t>
+      </w:r>
+      <w:r>
+        <w:rPr>
+          <w:rtl w:val="0"/>
+        </w:rPr>
+        <w:t xml:space="preserve">). Navigacija između stranica realizovana je putem Spring MVC routing mehanizma, gde svaki URL endpoint u kontroleru vraća odgovarajući view (HTML stranicu). </w:t>
+      </w:r>
+    </w:p>
+    <w:p>
+      <w:pPr>
+        <w:spacing w:after="240" w:before="240" w:lineRule="auto"/>
+        <w:rPr/>
+      </w:pPr>
+      <w:r>
+        <w:rPr>
+          <w:rtl w:val="0"/>
+        </w:rPr>
+        <w:t xml:space="preserve">Poseban akcenat stavljen je na jednostavnost korisničkog iskustva (UX), gde su sve ključne funkcionalnosti dostupne kroz jasan i konzistentan meni, kao i kroz intuitivne forme za unos podataka. Takođe, za poboljšanje korisničkog iskustva implementirani su alert sistemi koji prikazuju statusne poruke (uspeh ili greška) nakon izvršenih akcija, koristeći query parametre i Thymeleaf uslove.</w:t>
+      </w:r>
+    </w:p>
+    <w:p>
+      <w:pPr>
+        <w:spacing w:after="240" w:before="240" w:lineRule="auto"/>
+        <w:rPr/>
+      </w:pPr>
+      <w:r>
+        <w:rPr>
+          <w:rtl w:val="0"/>
+        </w:rPr>
+        <w:t xml:space="preserve">Interfejs je dizajniran tako da podržava osnovne CRUD operacije nad entitetima (kreiranje, pregled, izmena i brisanje događaja), kao i dodatne funkcionalnosti poput rezervacije događaja i dodavanja komentara.</w:t>
+      </w:r>
+    </w:p>
+    <w:p>
+      <w:pPr>
+        <w:pStyle w:val="Heading2"/>
+        <w:jc w:val="both"/>
+        <w:rPr/>
+      </w:pPr>
+      <w:bookmarkStart w:colFirst="0" w:colLast="0" w:name="_mc1n4g9tc5p1" w:id="5"/>
+      <w:bookmarkEnd w:id="5"/>
+      <w:r>
+        <w:rPr>
+          <w:rtl w:val="0"/>
+        </w:rPr>
+        <w:t xml:space="preserve">3.1. Pregled ključnih stranica</w:t>
+      </w:r>
+    </w:p>
+    <w:p>
+      <w:pPr>
+        <w:pStyle w:val="Heading3"/>
+        <w:rPr/>
+      </w:pPr>
+      <w:bookmarkStart w:colFirst="0" w:colLast="0" w:name="_q9m8zuoz8fen" w:id="6"/>
+      <w:bookmarkEnd w:id="6"/>
+      <w:r>
+        <w:rPr>
+          <w:rtl w:val="0"/>
+        </w:rPr>
+        <w:t xml:space="preserve">3.1.1. Login </w:t>
+      </w:r>
+    </w:p>
+    <w:p>
+      <w:pPr>
+        <w:rPr/>
+      </w:pPr>
+      <w:r>
+        <w:rPr/>
+        <w:drawing>
+          <wp:inline distB="114300" distT="114300" distL="114300" distR="114300">
+            <wp:extent cx="5656792" cy="6019800"/>
+            <wp:effectExtent b="0" l="0" r="0" t="0"/>
+            <wp:docPr id="8" name="image9.png"/>
+            <a:graphic>
+              <a:graphicData uri="http://schemas.openxmlformats.org/drawingml/2006/picture">
+                <pic:pic>
+                  <pic:nvPicPr>
+                    <pic:cNvPr id="0" name="image9.png"/>
+                    <pic:cNvPicPr preferRelativeResize="0"/>
+                  </pic:nvPicPr>
+                  <pic:blipFill>
+                    <a:blip r:embed="rId8"/>
+                    <a:srcRect b="0" l="1347" r="0" t="0"/>
+                    <a:stretch>
+                      <a:fillRect/>
+                    </a:stretch>
+                  </pic:blipFill>
+                  <pic:spPr>
+                    <a:xfrm>
+                      <a:off x="0" y="0"/>
+                      <a:ext cx="5656792" cy="6019800"/>
+                    </a:xfrm>
+                    <a:prstGeom prst="rect"/>
+                    <a:ln/>
+                  </pic:spPr>
+                </pic:pic>
+              </a:graphicData>
+            </a:graphic>
+          </wp:inline>
+        </w:drawing>
+      </w:r>
+      <w:r>
+        <w:rPr>
+          <w:rtl w:val="0"/>
+        </w:rPr>
+      </w:r>
+    </w:p>
+    <w:p>
+      <w:pPr>
+        <w:jc w:val="center"/>
+        <w:rPr>
+          <w:i w:val="1"/>
+          <w:iCs w:val="1"/>
+          <w:sz w:val="18"/>
+          <w:szCs w:val="18"/>
+        </w:rPr>
+      </w:pPr>
+      <w:r>
+        <w:rPr>
+          <w:i w:val="1"/>
+          <w:iCs w:val="1"/>
+          <w:sz w:val="18"/>
+          <w:szCs w:val="18"/>
+          <w:rtl w:val="0"/>
+        </w:rPr>
+        <w:t xml:space="preserve">Slika 2 - Login stranica</w:t>
+      </w:r>
+    </w:p>
+    <w:p>
+      <w:pPr>
+        <w:rPr/>
+      </w:pPr>
+      <w:r>
+        <w:rPr>
+          <w:rtl w:val="0"/>
+        </w:rPr>
+        <w:t xml:space="preserve">Stranica za prijavu omogućava autentifikaciju korisnika unosom email adrese. Nakon uspešne prijave, korisnik se čuva u sesiji kroz </w:t>
+      </w:r>
+      <w:r>
+        <w:rPr>
+          <w:i w:val="1"/>
+          <w:iCs w:val="1"/>
+          <w:rtl w:val="0"/>
+        </w:rPr>
+        <w:t xml:space="preserve">SessionUser </w:t>
+      </w:r>
+      <w:r>
+        <w:rPr>
+          <w:rtl w:val="0"/>
+        </w:rPr>
+        <w:t xml:space="preserve">klasu. Ova stranica predstavlja ulaznu tačku u sistem i obezbeđuje kontrolu pristupa funkcionalnostima aplikacije.</w:t>
+      </w:r>
+    </w:p>
+    <w:p>
+      <w:pPr>
+        <w:pStyle w:val="Heading3"/>
+        <w:rPr/>
+      </w:pPr>
+      <w:bookmarkStart w:colFirst="0" w:colLast="0" w:name="_jr8czs1yoyuf" w:id="7"/>
+      <w:bookmarkEnd w:id="7"/>
+      <w:r>
+        <w:rPr>
+          <w:rtl w:val="0"/>
+        </w:rPr>
+        <w:t xml:space="preserve">3.1.2. Events</w:t>
+      </w:r>
+    </w:p>
+    <w:p>
+      <w:pPr>
+        <w:pStyle w:val="Heading3"/>
+        <w:rPr/>
+      </w:pPr>
+      <w:bookmarkStart w:colFirst="0" w:colLast="0" w:name="_5hprjba5s4" w:id="8"/>
+      <w:bookmarkEnd w:id="8"/>
+      <w:r>
+        <w:rPr>
+          <w:rtl w:val="0"/>
+        </w:rPr>
+        <w:t xml:space="preserve"> </w:t>
+      </w:r>
+      <w:r>
+        <w:rPr/>
+        <w:drawing>
+          <wp:inline distB="114300" distT="114300" distL="114300" distR="114300">
+            <wp:extent cx="5731200" cy="6032500"/>
+            <wp:effectExtent b="0" l="0" r="0" t="0"/>
+            <wp:docPr id="7" name="image10.png"/>
+            <a:graphic>
+              <a:graphicData uri="http://schemas.openxmlformats.org/drawingml/2006/picture">
+                <pic:pic>
+                  <pic:nvPicPr>
+                    <pic:cNvPr id="0" name="image10.png"/>
+                    <pic:cNvPicPr preferRelativeResize="0"/>
+                  </pic:nvPicPr>
+                  <pic:blipFill>
+                    <a:blip r:embed="rId9"/>
+                    <a:srcRect b="0" l="0" r="0" t="0"/>
+                    <a:stretch>
+                      <a:fillRect/>
+                    </a:stretch>
+                  </pic:blipFill>
+                  <pic:spPr>
+                    <a:xfrm>
+                      <a:off x="0" y="0"/>
+                      <a:ext cx="5731200" cy="6032500"/>
+                    </a:xfrm>
+                    <a:prstGeom prst="rect"/>
+                    <a:ln/>
+                  </pic:spPr>
+                </pic:pic>
+              </a:graphicData>
+            </a:graphic>
+          </wp:inline>
+        </w:drawing>
+      </w:r>
+      <w:r>
+        <w:rPr>
+          <w:rtl w:val="0"/>
+        </w:rPr>
+      </w:r>
+    </w:p>
+    <w:p>
+      <w:pPr>
+        <w:jc w:val="center"/>
+        <w:rPr/>
+      </w:pPr>
+      <w:r>
+        <w:rPr>
+          <w:i w:val="1"/>
+          <w:iCs w:val="1"/>
+          <w:sz w:val="18"/>
+          <w:szCs w:val="18"/>
+          <w:rtl w:val="0"/>
+        </w:rPr>
+        <w:t xml:space="preserve">Slika 3 - events stranica</w:t>
+      </w:r>
+      <w:r>
+        <w:rPr>
+          <w:rtl w:val="0"/>
+        </w:rPr>
+      </w:r>
+    </w:p>
+    <w:p>
+      <w:pPr>
+        <w:rPr/>
+      </w:pPr>
+      <w:r>
+        <w:rPr>
+          <w:rtl w:val="0"/>
+        </w:rPr>
+        <w:t xml:space="preserve">Početna stranica prikazuje listu svih dostupnih događaja u sistemu. Podaci se dinamički učitavaju iz EventService sloja i prikazuju pomoću Thymeleaf th:each petlje. Svaki događaj je prikazan u formi kartice koja sadrži osnovne informacije i link ka detaljnom prikazu događaja. Ova stranica predstavlja centralnu tačku navigacije aplikacije. </w:t>
+      </w:r>
+    </w:p>
+    <w:p>
+      <w:pPr>
+        <w:pStyle w:val="Heading3"/>
+        <w:rPr/>
+      </w:pPr>
+      <w:bookmarkStart w:colFirst="0" w:colLast="0" w:name="_ehoz68g7lz" w:id="9"/>
+      <w:bookmarkEnd w:id="9"/>
+      <w:r>
+        <w:rPr>
+          <w:rtl w:val="0"/>
+        </w:rPr>
+        <w:t xml:space="preserve">3.1.3. Stranice za pregled i manipulaciju događajima i rezervacijama</w:t>
+      </w:r>
+    </w:p>
+    <w:p>
+      <w:pPr>
+        <w:jc w:val="center"/>
+        <w:rPr/>
+      </w:pPr>
+      <w:r>
+        <w:rPr/>
+        <w:drawing>
+          <wp:inline distB="114300" distT="114300" distL="114300" distR="114300">
+            <wp:extent cx="5731200" cy="6045200"/>
+            <wp:effectExtent b="0" l="0" r="0" t="0"/>
+            <wp:docPr id="5" name="image19.png"/>
+            <a:graphic>
+              <a:graphicData uri="http://schemas.openxmlformats.org/drawingml/2006/picture">
+                <pic:pic>
+                  <pic:nvPicPr>
+                    <pic:cNvPr id="0" name="image19.png"/>
+                    <pic:cNvPicPr preferRelativeResize="0"/>
+                  </pic:nvPicPr>
+                  <pic:blipFill>
+                    <a:blip r:embed="rId10"/>
+                    <a:srcRect b="0" l="0" r="0" t="0"/>
+                    <a:stretch>
+                      <a:fillRect/>
+                    </a:stretch>
+                  </pic:blipFill>
+                  <pic:spPr>
+                    <a:xfrm>
+                      <a:off x="0" y="0"/>
+                      <a:ext cx="5731200" cy="6045200"/>
+                    </a:xfrm>
+                    <a:prstGeom prst="rect"/>
+                    <a:ln/>
+                  </pic:spPr>
+                </pic:pic>
+              </a:graphicData>
+            </a:graphic>
+          </wp:inline>
+        </w:drawing>
+      </w:r>
+      <w:r>
+        <w:rPr>
+          <w:rtl w:val="0"/>
+        </w:rPr>
+      </w:r>
+    </w:p>
+    <w:p>
+      <w:pPr>
+        <w:jc w:val="center"/>
+        <w:rPr/>
+      </w:pPr>
+      <w:r>
+        <w:rPr>
+          <w:i w:val="1"/>
+          <w:iCs w:val="1"/>
+          <w:sz w:val="18"/>
+          <w:szCs w:val="18"/>
+          <w:rtl w:val="0"/>
+        </w:rPr>
+        <w:t xml:space="preserve">Slika 4 - My-events stranica</w:t>
+      </w:r>
+      <w:r>
+        <w:rPr>
+          <w:rtl w:val="0"/>
+        </w:rPr>
+      </w:r>
+    </w:p>
+    <w:p>
+      <w:pPr>
+        <w:jc w:val="center"/>
+        <w:rPr/>
+      </w:pPr>
+      <w:r>
+        <w:rPr/>
+        <w:drawing>
+          <wp:inline distB="114300" distT="114300" distL="114300" distR="114300">
+            <wp:extent cx="5731200" cy="6045200"/>
+            <wp:effectExtent b="0" l="0" r="0" t="0"/>
+            <wp:docPr id="10" name="image15.png"/>
+            <a:graphic>
+              <a:graphicData uri="http://schemas.openxmlformats.org/drawingml/2006/picture">
+                <pic:pic>
+                  <pic:nvPicPr>
+                    <pic:cNvPr id="0" name="image15.png"/>
+                    <pic:cNvPicPr preferRelativeResize="0"/>
+                  </pic:nvPicPr>
+                  <pic:blipFill>
+                    <a:blip r:embed="rId11"/>
+                    <a:srcRect b="0" l="0" r="0" t="0"/>
+                    <a:stretch>
+                      <a:fillRect/>
+                    </a:stretch>
+                  </pic:blipFill>
+                  <pic:spPr>
+                    <a:xfrm>
+                      <a:off x="0" y="0"/>
+                      <a:ext cx="5731200" cy="6045200"/>
+                    </a:xfrm>
+                    <a:prstGeom prst="rect"/>
+                    <a:ln/>
+                  </pic:spPr>
+                </pic:pic>
+              </a:graphicData>
+            </a:graphic>
+          </wp:inline>
+        </w:drawing>
+      </w:r>
+      <w:r>
+        <w:rPr>
+          <w:rtl w:val="0"/>
+        </w:rPr>
+      </w:r>
+    </w:p>
+    <w:p>
+      <w:pPr>
+        <w:jc w:val="center"/>
+        <w:rPr/>
+      </w:pPr>
+      <w:r>
+        <w:rPr>
+          <w:i w:val="1"/>
+          <w:iCs w:val="1"/>
+          <w:sz w:val="18"/>
+          <w:szCs w:val="18"/>
+          <w:rtl w:val="0"/>
+        </w:rPr>
+        <w:t xml:space="preserve">Slika 5 - Event details stranica</w:t>
+      </w:r>
+      <w:r>
+        <w:rPr>
+          <w:rtl w:val="0"/>
+        </w:rPr>
+      </w:r>
+    </w:p>
+    <w:p>
+      <w:pPr>
+        <w:jc w:val="center"/>
+        <w:rPr/>
+      </w:pPr>
+      <w:r>
+        <w:rPr/>
+        <w:drawing>
+          <wp:inline distB="114300" distT="114300" distL="114300" distR="114300">
+            <wp:extent cx="5529400" cy="5829300"/>
+            <wp:effectExtent b="0" l="0" r="0" t="0"/>
+            <wp:docPr id="2" name="image21.png"/>
+            <a:graphic>
+              <a:graphicData uri="http://schemas.openxmlformats.org/drawingml/2006/picture">
+                <pic:pic>
+                  <pic:nvPicPr>
+                    <pic:cNvPr id="0" name="image21.png"/>
+                    <pic:cNvPicPr preferRelativeResize="0"/>
+                  </pic:nvPicPr>
+                  <pic:blipFill>
+                    <a:blip r:embed="rId12"/>
+                    <a:srcRect b="0" l="0" r="0" t="0"/>
+                    <a:stretch>
+                      <a:fillRect/>
+                    </a:stretch>
+                  </pic:blipFill>
+                  <pic:spPr>
+                    <a:xfrm>
+                      <a:off x="0" y="0"/>
+                      <a:ext cx="5529400" cy="5829300"/>
+                    </a:xfrm>
+                    <a:prstGeom prst="rect"/>
+                    <a:ln/>
+                  </pic:spPr>
+                </pic:pic>
+              </a:graphicData>
+            </a:graphic>
+          </wp:inline>
+        </w:drawing>
+      </w:r>
+      <w:r>
+        <w:rPr>
+          <w:rtl w:val="0"/>
+        </w:rPr>
+      </w:r>
+    </w:p>
+    <w:p>
+      <w:pPr>
+        <w:jc w:val="center"/>
+        <w:rPr/>
+      </w:pPr>
+      <w:r>
+        <w:rPr>
+          <w:i w:val="1"/>
+          <w:iCs w:val="1"/>
+          <w:sz w:val="18"/>
+          <w:szCs w:val="18"/>
+          <w:rtl w:val="0"/>
+        </w:rPr>
+        <w:t xml:space="preserve">Slika 6 - My-reservations stranica</w:t>
+      </w:r>
+      <w:r>
+        <w:rPr>
+          <w:rtl w:val="0"/>
+        </w:rPr>
+      </w:r>
+    </w:p>
+    <w:p>
+      <w:pPr>
+        <w:rPr/>
+      </w:pPr>
+      <w:r>
+        <w:rPr>
+          <w:rtl w:val="0"/>
+        </w:rPr>
+        <w:t xml:space="preserve">Stranice za pregled i manipulaciju podacima su:</w:t>
+      </w:r>
+    </w:p>
+    <w:p>
+      <w:pPr>
+        <w:numPr>
+          <w:ilvl w:val="0"/>
+          <w:numId w:val="5"/>
+        </w:numPr>
+        <w:spacing w:after="0" w:afterAutospacing="0"/>
+        <w:ind w:left="720" w:hanging="360"/>
+        <w:rPr>
+          <w:u w:val="none"/>
+        </w:rPr>
+      </w:pPr>
+      <w:r>
+        <w:rPr>
+          <w:i w:val="1"/>
+          <w:iCs w:val="1"/>
+          <w:rtl w:val="0"/>
+        </w:rPr>
+        <w:t xml:space="preserve">my-events</w:t>
+      </w:r>
+    </w:p>
+    <w:p>
+      <w:pPr>
+        <w:numPr>
+          <w:ilvl w:val="0"/>
+          <w:numId w:val="5"/>
+        </w:numPr>
+        <w:spacing w:after="0" w:afterAutospacing="0" w:before="0" w:beforeAutospacing="0"/>
+        <w:ind w:left="720" w:hanging="360"/>
+        <w:rPr>
+          <w:u w:val="none"/>
+        </w:rPr>
+      </w:pPr>
+      <w:r>
+        <w:rPr>
+          <w:i w:val="1"/>
+          <w:iCs w:val="1"/>
+          <w:rtl w:val="0"/>
+        </w:rPr>
+        <w:t xml:space="preserve">my-reservations</w:t>
+      </w:r>
+    </w:p>
+    <w:p>
+      <w:pPr>
+        <w:numPr>
+          <w:ilvl w:val="0"/>
+          <w:numId w:val="5"/>
+        </w:numPr>
+        <w:spacing w:before="0" w:beforeAutospacing="0"/>
+        <w:ind w:left="720" w:hanging="360"/>
+        <w:rPr>
+          <w:u w:val="none"/>
+        </w:rPr>
+      </w:pPr>
+      <w:r>
+        <w:rPr>
+          <w:i w:val="1"/>
+          <w:iCs w:val="1"/>
+          <w:rtl w:val="0"/>
+        </w:rPr>
+        <w:t xml:space="preserve">details</w:t>
+      </w:r>
+      <w:r>
+        <w:rPr>
+          <w:rtl w:val="0"/>
+        </w:rPr>
+        <w:t xml:space="preserve">.</w:t>
+      </w:r>
+    </w:p>
+    <w:p>
+      <w:pPr>
+        <w:rPr/>
+      </w:pPr>
+      <w:r>
+        <w:rPr>
+          <w:rtl w:val="0"/>
+        </w:rPr>
+        <w:t xml:space="preserve">My-events stranica prikazuje događaje kreirane od strane prijavljenog korisnika. Nad njima se mogu izvršavati sve CRUD operacije, uz napomenu da se događaji kreiraju biranjem odgovarajuće opcije iz menija koja vodi do forme za popunjavanje o detaljima događaja.</w:t>
+      </w:r>
+    </w:p>
+    <w:p>
+      <w:pPr>
+        <w:rPr/>
+      </w:pPr>
+      <w:r>
+        <w:rPr>
+          <w:rtl w:val="0"/>
+        </w:rPr>
+        <w:t xml:space="preserve">U okviru details stranice prikazani su svi detalji jednog izabranog događaja, kao i komentari ostavljeni od strane drugih korisnika aplikacije u vezi sa njim. Korisnik otvaranjem ove stranice može ostaviti rezervaciju za događaj, odnosno prijaviti se da želi da prisustvuje dešavanju. Takođe, može ostaviti svoj komentar ispod detalja događaja koji drugi korisnici mogu kasnije pročitati.</w:t>
+      </w:r>
+    </w:p>
+    <w:p>
+      <w:pPr>
+        <w:rPr/>
+      </w:pPr>
+      <w:r>
+        <w:rPr>
+          <w:rtl w:val="0"/>
+        </w:rPr>
+        <w:t xml:space="preserve">My-reservations stranica prikazuje sve korisnikove rezervacije, odnosno prijave na različite događaje. Svaka rezervacija je predstavljena u okviru posebne kartice gde se prikazuju sve važne informacije o događaju kao što su naziv, vreme, mesto i kategorija, kao i vreme prijave. Na ovoj stranici korisnik može obrisati svoju rezervaciju, odnosno prijavu, ali i otvoriti stranicu sa detaljima događaja u slučaju da želi da se podseti o kom se događaju tačno radi.</w:t>
+      </w:r>
+    </w:p>
+    <w:p>
+      <w:pPr>
+        <w:pStyle w:val="Heading3"/>
+        <w:rPr/>
+      </w:pPr>
+      <w:bookmarkStart w:colFirst="0" w:colLast="0" w:name="_o2pkhd6pg9k" w:id="10"/>
+      <w:bookmarkEnd w:id="10"/>
+      <w:r>
+        <w:rPr>
+          <w:rtl w:val="0"/>
+        </w:rPr>
+        <w:t xml:space="preserve">3.1.4. Forme</w:t>
+      </w:r>
+    </w:p>
+    <w:p>
+      <w:pPr>
+        <w:rPr/>
+      </w:pPr>
+      <w:r>
+        <w:rPr/>
+        <w:drawing>
+          <wp:inline distB="114300" distT="114300" distL="114300" distR="114300">
+            <wp:extent cx="5731200" cy="6007100"/>
+            <wp:effectExtent b="0" l="0" r="0" t="0"/>
+            <wp:docPr id="20" name="image22.png"/>
+            <a:graphic>
+              <a:graphicData uri="http://schemas.openxmlformats.org/drawingml/2006/picture">
+                <pic:pic>
+                  <pic:nvPicPr>
+                    <pic:cNvPr id="0" name="image22.png"/>
+                    <pic:cNvPicPr preferRelativeResize="0"/>
+                  </pic:nvPicPr>
+                  <pic:blipFill>
+                    <a:blip r:embed="rId13"/>
+                    <a:srcRect b="0" l="0" r="0" t="0"/>
+                    <a:stretch>
+                      <a:fillRect/>
+                    </a:stretch>
+                  </pic:blipFill>
+                  <pic:spPr>
+                    <a:xfrm>
+                      <a:off x="0" y="0"/>
+                      <a:ext cx="5731200" cy="6007100"/>
+                    </a:xfrm>
+                    <a:prstGeom prst="rect"/>
+                    <a:ln/>
+                  </pic:spPr>
+                </pic:pic>
+              </a:graphicData>
+            </a:graphic>
+          </wp:inline>
+        </w:drawing>
+      </w:r>
+      <w:r>
+        <w:rPr>
+          <w:rtl w:val="0"/>
+        </w:rPr>
+      </w:r>
+    </w:p>
+    <w:p>
+      <w:pPr>
+        <w:jc w:val="center"/>
+        <w:rPr/>
+      </w:pPr>
+      <w:r>
+        <w:rPr>
+          <w:i w:val="1"/>
+          <w:iCs w:val="1"/>
+          <w:sz w:val="18"/>
+          <w:szCs w:val="18"/>
+          <w:rtl w:val="0"/>
+        </w:rPr>
+        <w:t xml:space="preserve">Slika 7 - Stranica create forme</w:t>
+      </w:r>
+      <w:r>
+        <w:rPr>
+          <w:rtl w:val="0"/>
+        </w:rPr>
+      </w:r>
+    </w:p>
+    <w:p>
+      <w:pPr>
+        <w:rPr/>
+      </w:pPr>
+      <w:r>
+        <w:rPr/>
+        <w:drawing>
+          <wp:inline distB="114300" distT="114300" distL="114300" distR="114300">
+            <wp:extent cx="5731200" cy="6019800"/>
+            <wp:effectExtent b="0" l="0" r="0" t="0"/>
+            <wp:docPr id="15" name="image18.png"/>
+            <a:graphic>
+              <a:graphicData uri="http://schemas.openxmlformats.org/drawingml/2006/picture">
+                <pic:pic>
+                  <pic:nvPicPr>
+                    <pic:cNvPr id="0" name="image18.png"/>
+                    <pic:cNvPicPr preferRelativeResize="0"/>
+                  </pic:nvPicPr>
+                  <pic:blipFill>
+                    <a:blip r:embed="rId14"/>
+                    <a:srcRect b="0" l="0" r="0" t="0"/>
+                    <a:stretch>
+                      <a:fillRect/>
+                    </a:stretch>
+                  </pic:blipFill>
+                  <pic:spPr>
+                    <a:xfrm>
+                      <a:off x="0" y="0"/>
+                      <a:ext cx="5731200" cy="6019800"/>
+                    </a:xfrm>
+                    <a:prstGeom prst="rect"/>
+                    <a:ln/>
+                  </pic:spPr>
+                </pic:pic>
+              </a:graphicData>
+            </a:graphic>
+          </wp:inline>
+        </w:drawing>
+      </w:r>
+      <w:r>
+        <w:rPr>
+          <w:rtl w:val="0"/>
+        </w:rPr>
+      </w:r>
+    </w:p>
+    <w:p>
+      <w:pPr>
+        <w:jc w:val="center"/>
+        <w:rPr/>
+      </w:pPr>
+      <w:r>
+        <w:rPr>
+          <w:i w:val="1"/>
+          <w:iCs w:val="1"/>
+          <w:sz w:val="18"/>
+          <w:szCs w:val="18"/>
+          <w:rtl w:val="0"/>
+        </w:rPr>
+        <w:t xml:space="preserve">Slika 8 - Stranica edit forme</w:t>
+      </w:r>
+      <w:r>
+        <w:rPr>
+          <w:rtl w:val="0"/>
+        </w:rPr>
+      </w:r>
+    </w:p>
+    <w:p>
+      <w:pPr>
+        <w:rPr/>
+      </w:pPr>
+      <w:r>
+        <w:rPr>
+          <w:rtl w:val="0"/>
+        </w:rPr>
+        <w:t xml:space="preserve">U okviru aplikacije mogu se koristiti dve forme istog formata: </w:t>
+      </w:r>
+    </w:p>
+    <w:p>
+      <w:pPr>
+        <w:numPr>
+          <w:ilvl w:val="0"/>
+          <w:numId w:val="6"/>
+        </w:numPr>
+        <w:spacing w:after="0" w:afterAutospacing="0"/>
+        <w:ind w:left="720" w:hanging="360"/>
+        <w:rPr>
+          <w:u w:val="none"/>
+        </w:rPr>
+      </w:pPr>
+      <w:r>
+        <w:rPr>
+          <w:rtl w:val="0"/>
+        </w:rPr>
+        <w:t xml:space="preserve">forma za kreiranje događaja koja dolazi prazna i kada korisnik popuni sva polja sa informacijama o događaju, može ga sačuvati klikom na dugme “Kreiraj događaj” i aplikacija će ga zatim preusmeriti nazad na početnu stranicu sa listom svih događaja</w:t>
+      </w:r>
+    </w:p>
+    <w:p>
+      <w:pPr>
+        <w:numPr>
+          <w:ilvl w:val="0"/>
+          <w:numId w:val="6"/>
+        </w:numPr>
+        <w:spacing w:before="0" w:beforeAutospacing="0"/>
+        <w:ind w:left="720" w:hanging="360"/>
+        <w:rPr>
+          <w:u w:val="none"/>
+        </w:rPr>
+      </w:pPr>
+      <w:r>
+        <w:rPr>
+          <w:rtl w:val="0"/>
+        </w:rPr>
+        <w:t xml:space="preserve">forma za izmenu podataka o događaju se otvara sa unapred popunjena postojećim sačuvanim podacima o događaju koji je ranije kreiran, a kada korisnik izvrši izmene koje je želeo, može ih sačuvati klikom na dugme “Sačuvaj izmene” i biće usmeren ponovo na listu svih događaja</w:t>
+      </w:r>
+    </w:p>
+    <w:p>
+      <w:pPr>
+        <w:rPr/>
+      </w:pPr>
+      <w:r>
+        <w:rPr>
+          <w:rtl w:val="0"/>
+        </w:rPr>
+        <w:t xml:space="preserve">Sve stranice stilizovane su korišćenjem CSS stilizacije.</w:t>
+      </w:r>
+    </w:p>
+    <w:p>
+      <w:pPr>
+        <w:rPr/>
+        <w:sectPr>
+          <w:type w:val="nextPage"/>
+          <w:pgSz w:h="16834" w:w="11909" w:orient="portrait"/>
+          <w:pgMar w:bottom="1440" w:top="1440" w:left="1440" w:right="1440" w:header="720" w:footer="720"/>
+        </w:sectPr>
+      </w:pPr>
+      <w:r>
+        <w:rPr>
+          <w:rtl w:val="0"/>
+        </w:rPr>
+      </w:r>
+    </w:p>
+    <w:p>
+      <w:pPr>
+        <w:pStyle w:val="Heading1"/>
+        <w:numPr>
+          <w:ilvl w:val="0"/>
+          <w:numId w:val="8"/>
+        </w:numPr>
+        <w:rPr>
+          <w:u w:val="none"/>
+        </w:rPr>
+      </w:pPr>
+      <w:bookmarkStart w:colFirst="0" w:colLast="0" w:name="_bm1bupniiub8" w:id="11"/>
+      <w:bookmarkEnd w:id="11"/>
+      <w:r>
+        <w:rPr>
+          <w:rtl w:val="0"/>
+        </w:rPr>
+        <w:t xml:space="preserve">Backend implementacija</w:t>
+      </w:r>
+    </w:p>
+    <w:p>
+      <w:pPr>
+        <w:spacing w:after="240" w:before="240" w:lineRule="auto"/>
+        <w:rPr/>
+      </w:pPr>
+      <w:r>
+        <w:rPr>
+          <w:rtl w:val="0"/>
+        </w:rPr>
+        <w:t xml:space="preserve">Backend aplikacije implementiran je korišćenjem Spring Boot framework-a i zasniva se na MVC (Model–View–Controller) arhitekturi. Sistem je organizovan u više slojeva kako bi se postigla bolja modularnost, lakše održavanje i jasna podela odgovornosti između komponenti.</w:t>
+      </w:r>
+    </w:p>
+    <w:p>
+      <w:pPr>
+        <w:spacing w:after="240" w:before="240" w:lineRule="auto"/>
+        <w:rPr/>
+      </w:pPr>
+      <w:r>
+        <w:rPr>
+          <w:rtl w:val="0"/>
+        </w:rPr>
+        <w:t xml:space="preserve">Aplikacija ne koristi bazu podataka, već se svi podaci čuvaju u memoriji (in-memory storage), što znači da su podaci privremeni i resetuju se pri ponovnom pokretanju aplikacije. Upravljanje podacima realizovano je kroz servisni sloj, dok kontroleri upravljaju HTTP zahtevima i komunikacijom sa korisničkim interfejsom.</w:t>
+      </w:r>
+    </w:p>
+    <w:p>
+      <w:pPr>
+        <w:pStyle w:val="Heading2"/>
+        <w:rPr/>
+      </w:pPr>
+      <w:bookmarkStart w:colFirst="0" w:colLast="0" w:name="_wacfyv51syum" w:id="12"/>
+      <w:bookmarkEnd w:id="12"/>
+      <w:r>
+        <w:rPr>
+          <w:rtl w:val="0"/>
+        </w:rPr>
+        <w:t xml:space="preserve">4.1. Arhitektura aplikacije</w:t>
+      </w:r>
+    </w:p>
+    <w:p>
+      <w:pPr>
+        <w:rPr/>
+      </w:pPr>
+      <w:r>
+        <w:rPr/>
+        <w:drawing>
+          <wp:inline distB="114300" distT="114300" distL="114300" distR="114300">
+            <wp:extent cx="5133975" cy="5343525"/>
+            <wp:effectExtent b="0" l="0" r="0" t="0"/>
+            <wp:docPr id="19" name="image20.png"/>
+            <a:graphic>
+              <a:graphicData uri="http://schemas.openxmlformats.org/drawingml/2006/picture">
+                <pic:pic>
+                  <pic:nvPicPr>
+                    <pic:cNvPr id="0" name="image20.png"/>
+                    <pic:cNvPicPr preferRelativeResize="0"/>
+                  </pic:nvPicPr>
+                  <pic:blipFill>
+                    <a:blip r:embed="rId15"/>
+                    <a:srcRect b="0" l="0" r="0" t="0"/>
+                    <a:stretch>
+                      <a:fillRect/>
+                    </a:stretch>
+                  </pic:blipFill>
+                  <pic:spPr>
+                    <a:xfrm>
+                      <a:off x="0" y="0"/>
+                      <a:ext cx="5133975" cy="5343525"/>
+                    </a:xfrm>
+                    <a:prstGeom prst="rect"/>
+                    <a:ln/>
+                  </pic:spPr>
+                </pic:pic>
+              </a:graphicData>
+            </a:graphic>
+          </wp:inline>
+        </w:drawing>
+      </w:r>
+      <w:r>
+        <w:rPr>
+          <w:rtl w:val="0"/>
+        </w:rPr>
+      </w:r>
+    </w:p>
+    <w:p>
+      <w:pPr>
+        <w:jc w:val="center"/>
+        <w:rPr/>
+      </w:pPr>
+      <w:r>
+        <w:rPr>
+          <w:i w:val="1"/>
+          <w:iCs w:val="1"/>
+          <w:sz w:val="18"/>
+          <w:szCs w:val="18"/>
+          <w:rtl w:val="0"/>
+        </w:rPr>
+        <w:t xml:space="preserve">Slika 9 - Paketi projekta</w:t>
+      </w:r>
+      <w:r>
+        <w:rPr>
+          <w:rtl w:val="0"/>
+        </w:rPr>
+      </w:r>
+    </w:p>
+    <w:p>
+      <w:pPr>
+        <w:rPr/>
+      </w:pPr>
+      <w:r>
+        <w:rPr>
+          <w:rtl w:val="0"/>
+        </w:rPr>
+      </w:r>
+    </w:p>
+    <w:p>
+      <w:pPr>
+        <w:spacing w:after="240" w:before="240" w:lineRule="auto"/>
+        <w:rPr/>
+      </w:pPr>
+      <w:r>
+        <w:rPr>
+          <w:rtl w:val="0"/>
+        </w:rPr>
+        <w:t xml:space="preserve">Aplikacija je implementirana u skladu sa pojednostavljenom slojevitom MVC arhitekturom koja se sastoji od sledećih delova:</w:t>
+      </w:r>
+    </w:p>
+    <w:p>
+      <w:pPr>
+        <w:numPr>
+          <w:ilvl w:val="0"/>
+          <w:numId w:val="7"/>
+        </w:numPr>
+        <w:spacing w:after="0" w:afterAutospacing="0" w:before="240" w:lineRule="auto"/>
+        <w:ind w:left="720" w:hanging="360"/>
+        <w:jc w:val="left"/>
+      </w:pPr>
+      <w:r>
+        <w:rPr>
+          <w:rtl w:val="0"/>
+        </w:rPr>
+        <w:t xml:space="preserve">Model sloj</w:t>
+      </w:r>
+      <w:r>
+        <w:rPr>
+          <w:rtl w:val="0"/>
+        </w:rPr>
+        <w:t xml:space="preserve"> – sadrži klase domena (Event, User, Comment, Reservation, Location, enum tip Category)</w:t>
+      </w:r>
+    </w:p>
+    <w:p>
+      <w:pPr>
+        <w:numPr>
+          <w:ilvl w:val="0"/>
+          <w:numId w:val="7"/>
+        </w:numPr>
+        <w:spacing w:after="0" w:afterAutospacing="0" w:before="0" w:beforeAutospacing="0" w:lineRule="auto"/>
+        <w:ind w:left="720" w:hanging="360"/>
+        <w:jc w:val="left"/>
+      </w:pPr>
+      <w:r>
+        <w:rPr>
+          <w:rtl w:val="0"/>
+        </w:rPr>
+        <w:t xml:space="preserve">Service sloj</w:t>
+      </w:r>
+      <w:r>
+        <w:rPr>
+          <w:rtl w:val="0"/>
+        </w:rPr>
+        <w:t xml:space="preserve"> – sadrži poslovnu logiku i upravljanje podacima u memoriji</w:t>
+      </w:r>
+    </w:p>
+    <w:p>
+      <w:pPr>
+        <w:numPr>
+          <w:ilvl w:val="0"/>
+          <w:numId w:val="7"/>
+        </w:numPr>
+        <w:spacing w:after="0" w:afterAutospacing="0" w:before="0" w:beforeAutospacing="0" w:lineRule="auto"/>
+        <w:ind w:left="720" w:hanging="360"/>
+        <w:jc w:val="left"/>
+      </w:pPr>
+      <w:r>
+        <w:rPr>
+          <w:rtl w:val="0"/>
+        </w:rPr>
+        <w:t xml:space="preserve">Controller sloj</w:t>
+      </w:r>
+      <w:r>
+        <w:rPr>
+          <w:rtl w:val="0"/>
+        </w:rPr>
+        <w:t xml:space="preserve"> – obrađuje HTTP zahteve i povezuje backend logiku sa view slojem (Thymeleaf)</w:t>
+      </w:r>
+    </w:p>
+    <w:p>
+      <w:pPr>
+        <w:numPr>
+          <w:ilvl w:val="0"/>
+          <w:numId w:val="7"/>
+        </w:numPr>
+        <w:ind w:left="720" w:hanging="360"/>
+      </w:pPr>
+      <w:r>
+        <w:rPr>
+          <w:rtl w:val="0"/>
+        </w:rPr>
+        <w:t xml:space="preserve">Util sloj – sadrži pomoćnu klasu  </w:t>
+      </w:r>
+      <w:r>
+        <w:rPr>
+          <w:i w:val="1"/>
+          <w:iCs w:val="1"/>
+          <w:rtl w:val="0"/>
+        </w:rPr>
+        <w:t xml:space="preserve">SessionUser</w:t>
+      </w:r>
+      <w:r>
+        <w:rPr>
+          <w:rtl w:val="0"/>
+        </w:rPr>
+        <w:t xml:space="preserve">, koja čuva trenutno ulogovanog korisnika</w:t>
+      </w:r>
+    </w:p>
+    <w:p>
+      <w:pPr>
+        <w:spacing w:after="240" w:before="240" w:lineRule="auto"/>
+        <w:rPr/>
+      </w:pPr>
+      <w:r>
+        <w:rPr>
+          <w:rtl w:val="0"/>
+        </w:rPr>
+        <w:t xml:space="preserve">Ovakva struktura omogućava jasnu separaciju odgovornosti i jednostavnije testiranje i proširivanje aplikacije.</w:t>
+      </w:r>
+    </w:p>
+    <w:p>
+      <w:pPr>
+        <w:pStyle w:val="Heading2"/>
+        <w:spacing w:after="240" w:before="240" w:lineRule="auto"/>
+        <w:rPr/>
+      </w:pPr>
+      <w:bookmarkStart w:colFirst="0" w:colLast="0" w:name="_u5nk6cg1tam8" w:id="13"/>
+      <w:bookmarkEnd w:id="13"/>
+      <w:r>
+        <w:rPr>
+          <w:rtl w:val="0"/>
+        </w:rPr>
+        <w:t xml:space="preserve">4.2. Sloj perzistencije</w:t>
+      </w:r>
+    </w:p>
+    <w:p>
+      <w:pPr>
+        <w:rPr/>
+      </w:pPr>
+      <w:r>
+        <w:rPr>
+          <w:rtl w:val="0"/>
+        </w:rPr>
+        <w:t xml:space="preserve">U ovoj verziji aplikacije nije korišćena baza podataka niti Spring Data JPA. Umesto toga, podaci se čuvaju u memoriji kroz </w:t>
+      </w:r>
+      <w:r>
+        <w:rPr>
+          <w:i w:val="1"/>
+          <w:iCs w:val="1"/>
+          <w:rtl w:val="0"/>
+        </w:rPr>
+        <w:t xml:space="preserve">List </w:t>
+      </w:r>
+      <w:r>
+        <w:rPr>
+          <w:rtl w:val="0"/>
+        </w:rPr>
+        <w:t xml:space="preserve">kolekcije unutar service klasa.</w:t>
+      </w:r>
+    </w:p>
+    <w:p>
+      <w:pPr>
+        <w:rPr/>
+      </w:pPr>
+      <w:r>
+        <w:rPr/>
+        <w:drawing>
+          <wp:inline distB="114300" distT="114300" distL="114300" distR="114300">
+            <wp:extent cx="5731200" cy="4013200"/>
+            <wp:effectExtent b="0" l="0" r="0" t="0"/>
+            <wp:docPr id="17" name="image16.png"/>
+            <a:graphic>
+              <a:graphicData uri="http://schemas.openxmlformats.org/drawingml/2006/picture">
+                <pic:pic>
+                  <pic:nvPicPr>
+                    <pic:cNvPr id="0" name="image16.png"/>
+                    <pic:cNvPicPr preferRelativeResize="0"/>
+                  </pic:nvPicPr>
+                  <pic:blipFill>
+                    <a:blip r:embed="rId16"/>
+                    <a:srcRect b="0" l="0" r="0" t="0"/>
+                    <a:stretch>
+                      <a:fillRect/>
+                    </a:stretch>
+                  </pic:blipFill>
+                  <pic:spPr>
+                    <a:xfrm>
+                      <a:off x="0" y="0"/>
+                      <a:ext cx="5731200" cy="4013200"/>
+                    </a:xfrm>
+                    <a:prstGeom prst="rect"/>
+                    <a:ln/>
+                  </pic:spPr>
+                </pic:pic>
+              </a:graphicData>
+            </a:graphic>
+          </wp:inline>
+        </w:drawing>
+      </w:r>
+      <w:r>
+        <w:rPr>
+          <w:rtl w:val="0"/>
+        </w:rPr>
+      </w:r>
+    </w:p>
+    <w:p>
+      <w:pPr>
+        <w:jc w:val="center"/>
+        <w:rPr/>
+      </w:pPr>
+      <w:r>
+        <w:rPr>
+          <w:i w:val="1"/>
+          <w:iCs w:val="1"/>
+          <w:sz w:val="18"/>
+          <w:szCs w:val="18"/>
+          <w:rtl w:val="0"/>
+        </w:rPr>
+        <w:t xml:space="preserve">Slika 10 - EventService klasa</w:t>
+      </w:r>
+      <w:r>
+        <w:rPr>
+          <w:rtl w:val="0"/>
+        </w:rPr>
+      </w:r>
+    </w:p>
+    <w:p>
+      <w:pPr>
+        <w:rPr/>
+      </w:pPr>
+      <w:r>
+        <w:rPr>
+          <w:rtl w:val="0"/>
+        </w:rPr>
+        <w:t xml:space="preserve">Svi događaji u aplikaciji čuvaju se unutar </w:t>
+      </w:r>
+      <w:r>
+        <w:rPr>
+          <w:i w:val="1"/>
+          <w:iCs w:val="1"/>
+          <w:rtl w:val="0"/>
+        </w:rPr>
+        <w:t xml:space="preserve">EventService </w:t>
+      </w:r>
+      <w:r>
+        <w:rPr>
+          <w:rtl w:val="0"/>
+        </w:rPr>
+        <w:t xml:space="preserve">klase u listi </w:t>
+      </w:r>
+      <w:r>
+        <w:rPr>
+          <w:i w:val="1"/>
+          <w:iCs w:val="1"/>
+          <w:rtl w:val="0"/>
+        </w:rPr>
+        <w:t xml:space="preserve">events</w:t>
+      </w:r>
+      <w:r>
+        <w:rPr>
+          <w:rtl w:val="0"/>
+        </w:rPr>
+        <w:t xml:space="preserve">. Postoje četiri događaja koji su hardcoded, kako bi pri pokretanju aplikacija izgledala realističnije.</w:t>
+      </w:r>
+    </w:p>
+    <w:p>
+      <w:pPr>
+        <w:rPr/>
+      </w:pPr>
+      <w:r>
+        <w:rPr/>
+        <w:drawing>
+          <wp:inline distB="114300" distT="114300" distL="114300" distR="114300">
+            <wp:extent cx="5731200" cy="3073400"/>
+            <wp:effectExtent b="0" l="0" r="0" t="0"/>
+            <wp:docPr id="16" name="image14.png"/>
+            <a:graphic>
+              <a:graphicData uri="http://schemas.openxmlformats.org/drawingml/2006/picture">
+                <pic:pic>
+                  <pic:nvPicPr>
+                    <pic:cNvPr id="0" name="image14.png"/>
+                    <pic:cNvPicPr preferRelativeResize="0"/>
+                  </pic:nvPicPr>
+                  <pic:blipFill>
+                    <a:blip r:embed="rId17"/>
+                    <a:srcRect b="0" l="0" r="0" t="0"/>
+                    <a:stretch>
+                      <a:fillRect/>
+                    </a:stretch>
+                  </pic:blipFill>
+                  <pic:spPr>
+                    <a:xfrm>
+                      <a:off x="0" y="0"/>
+                      <a:ext cx="5731200" cy="3073400"/>
+                    </a:xfrm>
+                    <a:prstGeom prst="rect"/>
+                    <a:ln/>
+                  </pic:spPr>
+                </pic:pic>
+              </a:graphicData>
+            </a:graphic>
+          </wp:inline>
+        </w:drawing>
+      </w:r>
+      <w:r>
+        <w:rPr>
+          <w:rtl w:val="0"/>
+        </w:rPr>
+      </w:r>
+    </w:p>
+    <w:p>
+      <w:pPr>
+        <w:jc w:val="center"/>
+        <w:rPr/>
+      </w:pPr>
+      <w:r>
+        <w:rPr>
+          <w:i w:val="1"/>
+          <w:iCs w:val="1"/>
+          <w:sz w:val="18"/>
+          <w:szCs w:val="18"/>
+          <w:rtl w:val="0"/>
+        </w:rPr>
+        <w:t xml:space="preserve">Slika 11 - UserService klasa</w:t>
+      </w:r>
+      <w:r>
+        <w:rPr>
+          <w:rtl w:val="0"/>
+        </w:rPr>
+      </w:r>
+    </w:p>
+    <w:p>
+      <w:pPr>
+        <w:rPr/>
+      </w:pPr>
+      <w:r>
+        <w:rPr>
+          <w:rtl w:val="0"/>
+        </w:rPr>
+        <w:t xml:space="preserve">U </w:t>
+      </w:r>
+      <w:r>
+        <w:rPr>
+          <w:i w:val="1"/>
+          <w:iCs w:val="1"/>
+          <w:rtl w:val="0"/>
+        </w:rPr>
+        <w:t xml:space="preserve">UserService </w:t>
+      </w:r>
+      <w:r>
+        <w:rPr>
+          <w:rtl w:val="0"/>
+        </w:rPr>
+        <w:t xml:space="preserve">klasi čuvaju se korisnici u </w:t>
+      </w:r>
+      <w:r>
+        <w:rPr>
+          <w:i w:val="1"/>
+          <w:iCs w:val="1"/>
+          <w:rtl w:val="0"/>
+        </w:rPr>
+        <w:t xml:space="preserve">users </w:t>
+      </w:r>
+      <w:r>
+        <w:rPr>
+          <w:rtl w:val="0"/>
+        </w:rPr>
+        <w:t xml:space="preserve">listi. Ovde ponovo imamo hardcoded dva korisnika kako bi se izbegao proces registracije korisnika, ali takođe i da bi već postojali neki događaji čiji je organizator prijavljeni korisnik. Ponovo, taj deo koda ubačen je zbog poboljšanja realističnosti sistema.</w:t>
+      </w:r>
+    </w:p>
+    <w:p>
+      <w:pPr>
+        <w:rPr/>
+      </w:pPr>
+      <w:r>
+        <w:rPr/>
+        <w:drawing>
+          <wp:inline distB="114300" distT="114300" distL="114300" distR="114300">
+            <wp:extent cx="5731200" cy="2552700"/>
+            <wp:effectExtent b="0" l="0" r="0" t="0"/>
+            <wp:docPr id="22" name="image17.png"/>
+            <a:graphic>
+              <a:graphicData uri="http://schemas.openxmlformats.org/drawingml/2006/picture">
+                <pic:pic>
+                  <pic:nvPicPr>
+                    <pic:cNvPr id="0" name="image17.png"/>
+                    <pic:cNvPicPr preferRelativeResize="0"/>
+                  </pic:nvPicPr>
+                  <pic:blipFill>
+                    <a:blip r:embed="rId18"/>
+                    <a:srcRect b="0" l="0" r="0" t="0"/>
+                    <a:stretch>
+                      <a:fillRect/>
+                    </a:stretch>
+                  </pic:blipFill>
+                  <pic:spPr>
+                    <a:xfrm>
+                      <a:off x="0" y="0"/>
+                      <a:ext cx="5731200" cy="2552700"/>
+                    </a:xfrm>
+                    <a:prstGeom prst="rect"/>
+                    <a:ln/>
+                  </pic:spPr>
+                </pic:pic>
+              </a:graphicData>
+            </a:graphic>
+          </wp:inline>
+        </w:drawing>
+      </w:r>
+      <w:r>
+        <w:rPr>
+          <w:rtl w:val="0"/>
+        </w:rPr>
+      </w:r>
+    </w:p>
+    <w:p>
+      <w:pPr>
+        <w:jc w:val="center"/>
+        <w:rPr/>
+      </w:pPr>
+      <w:r>
+        <w:rPr>
+          <w:i w:val="1"/>
+          <w:iCs w:val="1"/>
+          <w:sz w:val="18"/>
+          <w:szCs w:val="18"/>
+          <w:rtl w:val="0"/>
+        </w:rPr>
+        <w:t xml:space="preserve">Slika 12 - ReservationService klasa</w:t>
+      </w:r>
+      <w:r>
+        <w:rPr>
+          <w:rtl w:val="0"/>
+        </w:rPr>
+      </w:r>
+    </w:p>
+    <w:p>
+      <w:pPr>
+        <w:rPr/>
+      </w:pPr>
+      <w:r>
+        <w:rPr>
+          <w:rtl w:val="0"/>
+        </w:rPr>
+        <w:t xml:space="preserve">U </w:t>
+      </w:r>
+      <w:r>
+        <w:rPr>
+          <w:i w:val="1"/>
+          <w:iCs w:val="1"/>
+          <w:rtl w:val="0"/>
+        </w:rPr>
+        <w:t xml:space="preserve">ReservationService </w:t>
+      </w:r>
+      <w:r>
+        <w:rPr>
+          <w:rtl w:val="0"/>
+        </w:rPr>
+        <w:t xml:space="preserve">klasi čuvaju se sve korisničke rezervacije za događaje u aplikaciji. Lista </w:t>
+      </w:r>
+      <w:r>
+        <w:rPr>
+          <w:i w:val="1"/>
+          <w:iCs w:val="1"/>
+          <w:rtl w:val="0"/>
+        </w:rPr>
+        <w:t xml:space="preserve">reservations </w:t>
+      </w:r>
+      <w:r>
+        <w:rPr>
+          <w:rtl w:val="0"/>
+        </w:rPr>
+        <w:t xml:space="preserve">kreira se prazna.</w:t>
+      </w:r>
+    </w:p>
+    <w:p>
+      <w:pPr>
+        <w:rPr/>
+      </w:pPr>
+      <w:r>
+        <w:rPr/>
+        <w:drawing>
+          <wp:inline distB="114300" distT="114300" distL="114300" distR="114300">
+            <wp:extent cx="5731200" cy="3479800"/>
+            <wp:effectExtent b="0" l="0" r="0" t="0"/>
+            <wp:docPr id="6" name="image11.png"/>
+            <a:graphic>
+              <a:graphicData uri="http://schemas.openxmlformats.org/drawingml/2006/picture">
+                <pic:pic>
+                  <pic:nvPicPr>
+                    <pic:cNvPr id="0" name="image11.png"/>
+                    <pic:cNvPicPr preferRelativeResize="0"/>
+                  </pic:nvPicPr>
+                  <pic:blipFill>
+                    <a:blip r:embed="rId19"/>
+                    <a:srcRect b="0" l="0" r="0" t="0"/>
+                    <a:stretch>
+                      <a:fillRect/>
+                    </a:stretch>
+                  </pic:blipFill>
+                  <pic:spPr>
+                    <a:xfrm>
+                      <a:off x="0" y="0"/>
+                      <a:ext cx="5731200" cy="3479800"/>
+                    </a:xfrm>
+                    <a:prstGeom prst="rect"/>
+                    <a:ln/>
+                  </pic:spPr>
+                </pic:pic>
+              </a:graphicData>
+            </a:graphic>
+          </wp:inline>
+        </w:drawing>
+      </w:r>
+      <w:r>
+        <w:rPr>
+          <w:rtl w:val="0"/>
+        </w:rPr>
+      </w:r>
+    </w:p>
+    <w:p>
+      <w:pPr>
+        <w:jc w:val="center"/>
+        <w:rPr/>
+      </w:pPr>
+      <w:r>
+        <w:rPr>
+          <w:i w:val="1"/>
+          <w:iCs w:val="1"/>
+          <w:sz w:val="18"/>
+          <w:szCs w:val="18"/>
+          <w:rtl w:val="0"/>
+        </w:rPr>
+        <w:t xml:space="preserve">Slika 13 - CommentService klasa</w:t>
+      </w:r>
+      <w:r>
+        <w:rPr>
+          <w:rtl w:val="0"/>
+        </w:rPr>
+      </w:r>
+    </w:p>
+    <w:p>
+      <w:pPr>
+        <w:rPr/>
+      </w:pPr>
+      <w:r>
+        <w:rPr>
+          <w:rtl w:val="0"/>
+        </w:rPr>
+        <w:t xml:space="preserve">Svi komentari ostavljeni ispod događaja čuvaju se u </w:t>
+      </w:r>
+      <w:r>
+        <w:rPr>
+          <w:i w:val="1"/>
+          <w:iCs w:val="1"/>
+          <w:rtl w:val="0"/>
+        </w:rPr>
+        <w:t xml:space="preserve">comments </w:t>
+      </w:r>
+      <w:r>
+        <w:rPr>
+          <w:rtl w:val="0"/>
+        </w:rPr>
+        <w:t xml:space="preserve">listi u klasi </w:t>
+      </w:r>
+      <w:r>
+        <w:rPr>
+          <w:i w:val="1"/>
+          <w:iCs w:val="1"/>
+          <w:rtl w:val="0"/>
+        </w:rPr>
+        <w:t xml:space="preserve">CommentService</w:t>
+      </w:r>
+      <w:r>
+        <w:rPr>
+          <w:rtl w:val="0"/>
+        </w:rPr>
+        <w:t xml:space="preserve">. Kao i u slučaju događaja i korisnika, ponovo postoji određen broj hardcoded komentara koji će se prikazati u aplikaciji pri svakom pokretanju.</w:t>
+      </w:r>
+    </w:p>
+    <w:p>
+      <w:pPr>
+        <w:pStyle w:val="Heading2"/>
+        <w:rPr/>
+      </w:pPr>
+      <w:bookmarkStart w:colFirst="0" w:colLast="0" w:name="_7yijsvoxh92e" w:id="14"/>
+      <w:bookmarkEnd w:id="14"/>
+      <w:r>
+        <w:rPr>
+          <w:rtl w:val="0"/>
+        </w:rPr>
+        <w:t xml:space="preserve">4.3. Servisni sloj</w:t>
+      </w:r>
+    </w:p>
+    <w:p>
+      <w:pPr>
+        <w:rPr/>
+      </w:pPr>
+      <w:r>
+        <w:rPr>
+          <w:rtl w:val="0"/>
+        </w:rPr>
+        <w:t xml:space="preserve">Servisni sloj predstavlja centralni deo poslovne logike aplikacije. On sadrži klase koje upravljaju CRUD operacijama nad modelima i povezuju kontrolere sa podacima. </w:t>
+      </w:r>
+    </w:p>
+    <w:p>
+      <w:pPr>
+        <w:rPr/>
+      </w:pPr>
+      <w:r>
+        <w:rPr>
+          <w:rtl w:val="0"/>
+        </w:rPr>
+        <w:t xml:space="preserve">Svaki servis odgovoran je za određeni domen:</w:t>
+      </w:r>
+    </w:p>
+    <w:p>
+      <w:pPr>
+        <w:numPr>
+          <w:ilvl w:val="0"/>
+          <w:numId w:val="2"/>
+        </w:numPr>
+        <w:ind w:left="720" w:hanging="360"/>
+      </w:pPr>
+      <w:r>
+        <w:rPr>
+          <w:i w:val="1"/>
+          <w:iCs w:val="1"/>
+          <w:rtl w:val="0"/>
+        </w:rPr>
+        <w:t xml:space="preserve">EventService </w:t>
+      </w:r>
+      <w:r>
+        <w:rPr>
+          <w:rtl w:val="0"/>
+        </w:rPr>
+        <w:t xml:space="preserve">– upravljanje događajima</w:t>
+      </w:r>
+    </w:p>
+    <w:p>
+      <w:pPr>
+        <w:numPr>
+          <w:ilvl w:val="0"/>
+          <w:numId w:val="2"/>
+        </w:numPr>
+        <w:ind w:left="720" w:hanging="360"/>
+      </w:pPr>
+      <w:r>
+        <w:rPr>
+          <w:i w:val="1"/>
+          <w:iCs w:val="1"/>
+          <w:rtl w:val="0"/>
+        </w:rPr>
+        <w:t xml:space="preserve">CommentService </w:t>
+      </w:r>
+      <w:r>
+        <w:rPr>
+          <w:rtl w:val="0"/>
+        </w:rPr>
+        <w:t xml:space="preserve">– upravljanje komentarima</w:t>
+      </w:r>
+    </w:p>
+    <w:p>
+      <w:pPr>
+        <w:numPr>
+          <w:ilvl w:val="0"/>
+          <w:numId w:val="2"/>
+        </w:numPr>
+        <w:ind w:left="720" w:hanging="360"/>
+      </w:pPr>
+      <w:r>
+        <w:rPr>
+          <w:i w:val="1"/>
+          <w:iCs w:val="1"/>
+          <w:rtl w:val="0"/>
+        </w:rPr>
+        <w:t xml:space="preserve">ReservationService </w:t>
+      </w:r>
+      <w:r>
+        <w:rPr>
+          <w:rtl w:val="0"/>
+        </w:rPr>
+        <w:t xml:space="preserve">– upravljanje rezervacijama</w:t>
+      </w:r>
+    </w:p>
+    <w:p>
+      <w:pPr>
+        <w:numPr>
+          <w:ilvl w:val="0"/>
+          <w:numId w:val="2"/>
+        </w:numPr>
+        <w:ind w:left="720" w:hanging="360"/>
+      </w:pPr>
+      <w:r>
+        <w:rPr>
+          <w:i w:val="1"/>
+          <w:iCs w:val="1"/>
+          <w:rtl w:val="0"/>
+        </w:rPr>
+        <w:t xml:space="preserve">UserService </w:t>
+      </w:r>
+      <w:r>
+        <w:rPr>
+          <w:rtl w:val="0"/>
+        </w:rPr>
+        <w:t xml:space="preserve">– upravljanje korisnicima</w:t>
+      </w:r>
+    </w:p>
+    <w:p>
+      <w:pPr>
+        <w:rPr/>
+      </w:pPr>
+      <w:r>
+        <w:rPr>
+          <w:rtl w:val="0"/>
+        </w:rPr>
+        <w:t xml:space="preserve">Primeri metoda će biti prikazani u nastavku teksta.</w:t>
+      </w:r>
+    </w:p>
+    <w:p>
+      <w:pPr>
+        <w:rPr/>
+      </w:pPr>
+      <w:r>
+        <w:rPr/>
+        <w:drawing>
+          <wp:inline distB="114300" distT="114300" distL="114300" distR="114300">
+            <wp:extent cx="5731200" cy="4660900"/>
+            <wp:effectExtent b="0" l="0" r="0" t="0"/>
+            <wp:docPr id="3" name="image4.png"/>
+            <a:graphic>
+              <a:graphicData uri="http://schemas.openxmlformats.org/drawingml/2006/picture">
+                <pic:pic>
+                  <pic:nvPicPr>
+                    <pic:cNvPr id="0" name="image4.png"/>
+                    <pic:cNvPicPr preferRelativeResize="0"/>
+                  </pic:nvPicPr>
+                  <pic:blipFill>
+                    <a:blip r:embed="rId20"/>
+                    <a:srcRect b="0" l="0" r="0" t="0"/>
+                    <a:stretch>
+                      <a:fillRect/>
+                    </a:stretch>
+                  </pic:blipFill>
+                  <pic:spPr>
+                    <a:xfrm>
+                      <a:off x="0" y="0"/>
+                      <a:ext cx="5731200" cy="4660900"/>
+                    </a:xfrm>
+                    <a:prstGeom prst="rect"/>
+                    <a:ln/>
+                  </pic:spPr>
+                </pic:pic>
+              </a:graphicData>
+            </a:graphic>
+          </wp:inline>
+        </w:drawing>
+      </w:r>
+      <w:r>
+        <w:rPr>
+          <w:rtl w:val="0"/>
+        </w:rPr>
+      </w:r>
+    </w:p>
+    <w:p>
+      <w:pPr>
+        <w:jc w:val="center"/>
+        <w:rPr>
+          <w:i w:val="1"/>
+          <w:iCs w:val="1"/>
+          <w:sz w:val="18"/>
+          <w:szCs w:val="18"/>
+        </w:rPr>
+      </w:pPr>
+      <w:r>
+        <w:rPr>
+          <w:i w:val="1"/>
+          <w:iCs w:val="1"/>
+          <w:sz w:val="18"/>
+          <w:szCs w:val="18"/>
+          <w:rtl w:val="0"/>
+        </w:rPr>
+        <w:t xml:space="preserve">Slika 14 - Metode EventService klase</w:t>
+      </w:r>
+    </w:p>
+    <w:p>
+      <w:pPr>
+        <w:rPr/>
+      </w:pPr>
+      <w:r>
+        <w:rPr/>
+        <w:drawing>
+          <wp:inline distB="114300" distT="114300" distL="114300" distR="114300">
+            <wp:extent cx="5731200" cy="1981200"/>
+            <wp:effectExtent b="0" l="0" r="0" t="0"/>
+            <wp:docPr id="1" name="image12.png"/>
+            <a:graphic>
+              <a:graphicData uri="http://schemas.openxmlformats.org/drawingml/2006/picture">
+                <pic:pic>
+                  <pic:nvPicPr>
+                    <pic:cNvPr id="0" name="image12.png"/>
+                    <pic:cNvPicPr preferRelativeResize="0"/>
+                  </pic:nvPicPr>
+                  <pic:blipFill>
+                    <a:blip r:embed="rId21"/>
+                    <a:srcRect b="0" l="0" r="0" t="0"/>
+                    <a:stretch>
+                      <a:fillRect/>
+                    </a:stretch>
+                  </pic:blipFill>
+                  <pic:spPr>
+                    <a:xfrm>
+                      <a:off x="0" y="0"/>
+                      <a:ext cx="5731200" cy="1981200"/>
+                    </a:xfrm>
+                    <a:prstGeom prst="rect"/>
+                    <a:ln/>
+                  </pic:spPr>
+                </pic:pic>
+              </a:graphicData>
+            </a:graphic>
+          </wp:inline>
+        </w:drawing>
+      </w:r>
+      <w:r>
+        <w:rPr>
+          <w:rtl w:val="0"/>
+        </w:rPr>
+      </w:r>
+    </w:p>
+    <w:p>
+      <w:pPr>
+        <w:jc w:val="center"/>
+        <w:rPr/>
+      </w:pPr>
+      <w:r>
+        <w:rPr>
+          <w:i w:val="1"/>
+          <w:iCs w:val="1"/>
+          <w:sz w:val="18"/>
+          <w:szCs w:val="18"/>
+          <w:rtl w:val="0"/>
+        </w:rPr>
+        <w:t xml:space="preserve">Slika 15 - Metode UserService klase</w:t>
+      </w:r>
+      <w:r>
+        <w:rPr>
+          <w:rtl w:val="0"/>
+        </w:rPr>
+      </w:r>
+    </w:p>
+    <w:p>
+      <w:pPr>
+        <w:rPr/>
+      </w:pPr>
+      <w:r>
+        <w:rPr/>
+        <w:drawing>
+          <wp:inline distB="114300" distT="114300" distL="114300" distR="114300">
+            <wp:extent cx="5731200" cy="2197100"/>
+            <wp:effectExtent b="0" l="0" r="0" t="0"/>
+            <wp:docPr id="9" name="image3.png"/>
+            <a:graphic>
+              <a:graphicData uri="http://schemas.openxmlformats.org/drawingml/2006/picture">
+                <pic:pic>
+                  <pic:nvPicPr>
+                    <pic:cNvPr id="0" name="image3.png"/>
+                    <pic:cNvPicPr preferRelativeResize="0"/>
+                  </pic:nvPicPr>
+                  <pic:blipFill>
+                    <a:blip r:embed="rId22"/>
+                    <a:srcRect b="0" l="0" r="0" t="0"/>
+                    <a:stretch>
+                      <a:fillRect/>
+                    </a:stretch>
+                  </pic:blipFill>
+                  <pic:spPr>
+                    <a:xfrm>
+                      <a:off x="0" y="0"/>
+                      <a:ext cx="5731200" cy="2197100"/>
+                    </a:xfrm>
+                    <a:prstGeom prst="rect"/>
+                    <a:ln/>
+                  </pic:spPr>
+                </pic:pic>
+              </a:graphicData>
+            </a:graphic>
+          </wp:inline>
+        </w:drawing>
+      </w:r>
+      <w:r>
+        <w:rPr>
+          <w:rtl w:val="0"/>
+        </w:rPr>
+      </w:r>
+    </w:p>
+    <w:p>
+      <w:pPr>
+        <w:jc w:val="center"/>
+        <w:rPr/>
+      </w:pPr>
+      <w:r>
+        <w:rPr>
+          <w:i w:val="1"/>
+          <w:iCs w:val="1"/>
+          <w:sz w:val="18"/>
+          <w:szCs w:val="18"/>
+          <w:rtl w:val="0"/>
+        </w:rPr>
+        <w:t xml:space="preserve">Slika 16 - Metode ReservationService klase</w:t>
+      </w:r>
+      <w:r>
+        <w:rPr>
+          <w:rtl w:val="0"/>
+        </w:rPr>
+      </w:r>
+    </w:p>
+    <w:p>
+      <w:pPr>
+        <w:rPr/>
+      </w:pPr>
+      <w:r>
+        <w:rPr/>
+        <w:drawing>
+          <wp:inline distB="114300" distT="114300" distL="114300" distR="114300">
+            <wp:extent cx="5731200" cy="3035300"/>
+            <wp:effectExtent b="0" l="0" r="0" t="0"/>
+            <wp:docPr id="11" name="image2.png"/>
+            <a:graphic>
+              <a:graphicData uri="http://schemas.openxmlformats.org/drawingml/2006/picture">
+                <pic:pic>
+                  <pic:nvPicPr>
+                    <pic:cNvPr id="0" name="image2.png"/>
+                    <pic:cNvPicPr preferRelativeResize="0"/>
+                  </pic:nvPicPr>
+                  <pic:blipFill>
+                    <a:blip r:embed="rId23"/>
+                    <a:srcRect b="0" l="0" r="0" t="0"/>
+                    <a:stretch>
+                      <a:fillRect/>
+                    </a:stretch>
+                  </pic:blipFill>
+                  <pic:spPr>
+                    <a:xfrm>
+                      <a:off x="0" y="0"/>
+                      <a:ext cx="5731200" cy="3035300"/>
+                    </a:xfrm>
+                    <a:prstGeom prst="rect"/>
+                    <a:ln/>
+                  </pic:spPr>
+                </pic:pic>
+              </a:graphicData>
+            </a:graphic>
+          </wp:inline>
+        </w:drawing>
+      </w:r>
+      <w:r>
+        <w:rPr>
+          <w:rtl w:val="0"/>
+        </w:rPr>
+      </w:r>
+    </w:p>
+    <w:p>
+      <w:pPr>
+        <w:jc w:val="center"/>
+        <w:rPr>
+          <w:i w:val="1"/>
+          <w:iCs w:val="1"/>
+          <w:sz w:val="18"/>
+          <w:szCs w:val="18"/>
+        </w:rPr>
+      </w:pPr>
+      <w:r>
+        <w:rPr>
+          <w:i w:val="1"/>
+          <w:iCs w:val="1"/>
+          <w:sz w:val="18"/>
+          <w:szCs w:val="18"/>
+          <w:rtl w:val="0"/>
+        </w:rPr>
+        <w:t xml:space="preserve">Slika 17 - Metode CommentService klase</w:t>
+      </w:r>
+    </w:p>
+    <w:p>
+      <w:pPr>
+        <w:rPr/>
+      </w:pPr>
+      <w:r>
+        <w:rPr>
+          <w:rtl w:val="0"/>
+        </w:rPr>
+        <w:t xml:space="preserve">Servisni sloj u ovom projektu ne koristi </w:t>
+      </w:r>
+      <w:r>
+        <w:rPr>
+          <w:i w:val="1"/>
+          <w:iCs w:val="1"/>
+          <w:rtl w:val="0"/>
+        </w:rPr>
+        <w:t xml:space="preserve">@Transactional</w:t>
+      </w:r>
+      <w:r>
+        <w:rPr>
+          <w:rtl w:val="0"/>
+        </w:rPr>
+        <w:t xml:space="preserve"> anotaciju, jer ne postoji baza podataka niti transakcioni kontekst, već se svi podaci nalaze u memoriji.</w:t>
+      </w:r>
+    </w:p>
+    <w:p>
+      <w:pPr>
+        <w:rPr/>
+      </w:pPr>
+      <w:r>
+        <w:rPr>
+          <w:rtl w:val="0"/>
+        </w:rPr>
+        <w:t xml:space="preserve">Logika servisa uključuje:</w:t>
+      </w:r>
+    </w:p>
+    <w:p>
+      <w:pPr>
+        <w:numPr>
+          <w:ilvl w:val="0"/>
+          <w:numId w:val="3"/>
+        </w:numPr>
+        <w:ind w:left="720" w:hanging="360"/>
+      </w:pPr>
+      <w:r>
+        <w:rPr>
+          <w:rtl w:val="0"/>
+        </w:rPr>
+        <w:t xml:space="preserve">validaciju podataka</w:t>
+      </w:r>
+    </w:p>
+    <w:p>
+      <w:pPr>
+        <w:numPr>
+          <w:ilvl w:val="0"/>
+          <w:numId w:val="3"/>
+        </w:numPr>
+        <w:ind w:left="720" w:hanging="360"/>
+      </w:pPr>
+      <w:r>
+        <w:rPr>
+          <w:rtl w:val="0"/>
+        </w:rPr>
+        <w:t xml:space="preserve">pretragu entiteta po ID-u</w:t>
+      </w:r>
+    </w:p>
+    <w:p>
+      <w:pPr>
+        <w:numPr>
+          <w:ilvl w:val="0"/>
+          <w:numId w:val="3"/>
+        </w:numPr>
+        <w:ind w:left="720" w:hanging="360"/>
+      </w:pPr>
+      <w:r>
+        <w:rPr>
+          <w:rtl w:val="0"/>
+        </w:rPr>
+        <w:t xml:space="preserve">filtriranje podataka po korisniku</w:t>
+      </w:r>
+    </w:p>
+    <w:p>
+      <w:pPr>
+        <w:numPr>
+          <w:ilvl w:val="0"/>
+          <w:numId w:val="3"/>
+        </w:numPr>
+        <w:ind w:left="720" w:hanging="360"/>
+      </w:pPr>
+      <w:r>
+        <w:rPr>
+          <w:rtl w:val="0"/>
+        </w:rPr>
+        <w:t xml:space="preserve">povezivanje entiteta (npr. komentari i događaji)</w:t>
+      </w:r>
+    </w:p>
+    <w:p>
+      <w:pPr>
+        <w:rPr/>
+      </w:pPr>
+      <w:r>
+        <w:rPr>
+          <w:rtl w:val="0"/>
+        </w:rPr>
+      </w:r>
+    </w:p>
+    <w:p>
+      <w:pPr>
+        <w:pStyle w:val="Heading2"/>
+        <w:rPr/>
+      </w:pPr>
+      <w:bookmarkStart w:colFirst="0" w:colLast="0" w:name="_54vv7pdjqu4f" w:id="15"/>
+      <w:bookmarkEnd w:id="15"/>
+      <w:r>
+        <w:rPr>
+          <w:rtl w:val="0"/>
+        </w:rPr>
+        <w:t xml:space="preserve">4.4. Kontrolerski sloj</w:t>
+      </w:r>
+      <w:r>
+        <w:rPr>
+          <w:rtl w:val="0"/>
+        </w:rPr>
+      </w:r>
+    </w:p>
+    <w:p>
+      <w:pPr>
+        <w:rPr/>
+      </w:pPr>
+      <w:r>
+        <w:rPr>
+          <w:rtl w:val="0"/>
+        </w:rPr>
+        <w:t xml:space="preserve">Kontroleri predstavljaju ulaznu tačku aplikacije i zaduženi su za obradu HTTP zahteva i komunikaciju između korisničkog interfejsa i servisnog sloja.</w:t>
+      </w:r>
+    </w:p>
+    <w:p>
+      <w:pPr>
+        <w:rPr/>
+      </w:pPr>
+      <w:r>
+        <w:rPr>
+          <w:rtl w:val="0"/>
+        </w:rPr>
+        <w:t xml:space="preserve">U projektu su implementirani sledeći kontroleri:</w:t>
+      </w:r>
+    </w:p>
+    <w:p>
+      <w:pPr>
+        <w:numPr>
+          <w:ilvl w:val="0"/>
+          <w:numId w:val="4"/>
+        </w:numPr>
+        <w:ind w:left="720" w:hanging="360"/>
+        <w:rPr>
+          <w:i w:val="1"/>
+          <w:iCs w:val="1"/>
+        </w:rPr>
+      </w:pPr>
+      <w:r>
+        <w:rPr>
+          <w:i w:val="1"/>
+          <w:iCs w:val="1"/>
+          <w:rtl w:val="0"/>
+        </w:rPr>
+        <w:t xml:space="preserve">EventController</w:t>
+      </w:r>
+    </w:p>
+    <w:p>
+      <w:pPr>
+        <w:numPr>
+          <w:ilvl w:val="0"/>
+          <w:numId w:val="4"/>
+        </w:numPr>
+        <w:ind w:left="720" w:hanging="360"/>
+        <w:rPr>
+          <w:i w:val="1"/>
+          <w:iCs w:val="1"/>
+        </w:rPr>
+      </w:pPr>
+      <w:r>
+        <w:rPr>
+          <w:i w:val="1"/>
+          <w:iCs w:val="1"/>
+          <w:rtl w:val="0"/>
+        </w:rPr>
+        <w:t xml:space="preserve">UserController</w:t>
+      </w:r>
+    </w:p>
+    <w:p>
+      <w:pPr>
+        <w:numPr>
+          <w:ilvl w:val="0"/>
+          <w:numId w:val="4"/>
+        </w:numPr>
+        <w:ind w:left="720" w:hanging="360"/>
+        <w:rPr>
+          <w:i w:val="1"/>
+          <w:iCs w:val="1"/>
+        </w:rPr>
+      </w:pPr>
+      <w:r>
+        <w:rPr>
+          <w:i w:val="1"/>
+          <w:iCs w:val="1"/>
+          <w:rtl w:val="0"/>
+        </w:rPr>
+        <w:t xml:space="preserve">CommentController</w:t>
+      </w:r>
+    </w:p>
+    <w:p>
+      <w:pPr>
+        <w:numPr>
+          <w:ilvl w:val="0"/>
+          <w:numId w:val="4"/>
+        </w:numPr>
+        <w:ind w:left="720" w:hanging="360"/>
+        <w:rPr>
+          <w:i w:val="1"/>
+          <w:iCs w:val="1"/>
+        </w:rPr>
+      </w:pPr>
+      <w:r>
+        <w:rPr>
+          <w:i w:val="1"/>
+          <w:iCs w:val="1"/>
+          <w:rtl w:val="0"/>
+        </w:rPr>
+        <w:t xml:space="preserve">ReservationController</w:t>
+      </w:r>
+    </w:p>
+    <w:p>
+      <w:pPr>
+        <w:rPr/>
+      </w:pPr>
+      <w:r>
+        <w:rPr>
+          <w:rtl w:val="0"/>
+        </w:rPr>
+        <w:t xml:space="preserve">Kontroleri koriste anotacije @</w:t>
+      </w:r>
+      <w:r>
+        <w:rPr>
+          <w:i w:val="1"/>
+          <w:iCs w:val="1"/>
+          <w:rtl w:val="0"/>
+        </w:rPr>
+        <w:t xml:space="preserve">GetMapping</w:t>
+      </w:r>
+      <w:r>
+        <w:rPr>
+          <w:rtl w:val="0"/>
+        </w:rPr>
+        <w:t xml:space="preserve"> i @</w:t>
+      </w:r>
+      <w:r>
+        <w:rPr>
+          <w:i w:val="1"/>
+          <w:iCs w:val="1"/>
+          <w:rtl w:val="0"/>
+        </w:rPr>
+        <w:t xml:space="preserve">PostMapping</w:t>
+      </w:r>
+      <w:r>
+        <w:rPr>
+          <w:rtl w:val="0"/>
+        </w:rPr>
+        <w:t xml:space="preserve"> za mapiranje URL ruta.</w:t>
+      </w:r>
+    </w:p>
+    <w:p>
+      <w:pPr>
+        <w:rPr/>
+      </w:pPr>
+      <w:r>
+        <w:rPr>
+          <w:rtl w:val="0"/>
+        </w:rPr>
+        <w:t xml:space="preserve">Primeri metoda iz kontrolera će biti dati u nastavku teksta.</w:t>
+      </w:r>
+    </w:p>
+    <w:p>
+      <w:pPr>
+        <w:rPr/>
+      </w:pPr>
+      <w:r>
+        <w:rPr/>
+        <w:drawing>
+          <wp:inline distB="114300" distT="114300" distL="114300" distR="114300">
+            <wp:extent cx="5731200" cy="3670300"/>
+            <wp:effectExtent b="0" l="0" r="0" t="0"/>
+            <wp:docPr id="13" name="image1.png"/>
+            <a:graphic>
+              <a:graphicData uri="http://schemas.openxmlformats.org/drawingml/2006/picture">
+                <pic:pic>
+                  <pic:nvPicPr>
+                    <pic:cNvPr id="0" name="image1.png"/>
+                    <pic:cNvPicPr preferRelativeResize="0"/>
+                  </pic:nvPicPr>
+                  <pic:blipFill>
+                    <a:blip r:embed="rId24"/>
+                    <a:srcRect b="0" l="0" r="0" t="0"/>
+                    <a:stretch>
+                      <a:fillRect/>
+                    </a:stretch>
+                  </pic:blipFill>
+                  <pic:spPr>
+                    <a:xfrm>
+                      <a:off x="0" y="0"/>
+                      <a:ext cx="5731200" cy="3670300"/>
+                    </a:xfrm>
+                    <a:prstGeom prst="rect"/>
+                    <a:ln/>
+                  </pic:spPr>
+                </pic:pic>
+              </a:graphicData>
+            </a:graphic>
+          </wp:inline>
+        </w:drawing>
+      </w:r>
+      <w:r>
+        <w:rPr>
+          <w:rtl w:val="0"/>
+        </w:rPr>
+      </w:r>
+    </w:p>
+    <w:p>
+      <w:pPr>
+        <w:jc w:val="center"/>
+        <w:rPr/>
+      </w:pPr>
+      <w:r>
+        <w:rPr>
+          <w:i w:val="1"/>
+          <w:iCs w:val="1"/>
+          <w:sz w:val="18"/>
+          <w:szCs w:val="18"/>
+          <w:rtl w:val="0"/>
+        </w:rPr>
+        <w:t xml:space="preserve">Slika 18 - Post i Get metode UserController klase</w:t>
+      </w:r>
+      <w:r>
+        <w:rPr>
+          <w:rtl w:val="0"/>
+        </w:rPr>
+      </w:r>
+    </w:p>
+    <w:p>
+      <w:pPr>
+        <w:jc w:val="center"/>
+        <w:rPr/>
+      </w:pPr>
+      <w:r>
+        <w:rPr/>
+        <w:drawing>
+          <wp:inline distB="114300" distT="114300" distL="114300" distR="114300">
+            <wp:extent cx="5498111" cy="2881313"/>
+            <wp:effectExtent b="0" l="0" r="0" t="0"/>
+            <wp:docPr id="21" name="image13.png"/>
+            <a:graphic>
+              <a:graphicData uri="http://schemas.openxmlformats.org/drawingml/2006/picture">
+                <pic:pic>
+                  <pic:nvPicPr>
+                    <pic:cNvPr id="0" name="image13.png"/>
+                    <pic:cNvPicPr preferRelativeResize="0"/>
+                  </pic:nvPicPr>
+                  <pic:blipFill>
+                    <a:blip r:embed="rId25"/>
+                    <a:srcRect b="0" l="0" r="0" t="0"/>
+                    <a:stretch>
+                      <a:fillRect/>
+                    </a:stretch>
+                  </pic:blipFill>
+                  <pic:spPr>
+                    <a:xfrm>
+                      <a:off x="0" y="0"/>
+                      <a:ext cx="5498111" cy="2881313"/>
+                    </a:xfrm>
+                    <a:prstGeom prst="rect"/>
+                    <a:ln/>
+                  </pic:spPr>
+                </pic:pic>
+              </a:graphicData>
+            </a:graphic>
+          </wp:inline>
+        </w:drawing>
+      </w:r>
+      <w:r>
+        <w:rPr>
+          <w:rtl w:val="0"/>
+        </w:rPr>
+      </w:r>
+    </w:p>
+    <w:p>
+      <w:pPr>
+        <w:jc w:val="center"/>
+        <w:rPr/>
+      </w:pPr>
+      <w:r>
+        <w:rPr>
+          <w:i w:val="1"/>
+          <w:iCs w:val="1"/>
+          <w:sz w:val="18"/>
+          <w:szCs w:val="18"/>
+          <w:rtl w:val="0"/>
+        </w:rPr>
+        <w:t xml:space="preserve">Slika 19 - Get i Post metode ReservationController klase</w:t>
+      </w:r>
+      <w:r>
+        <w:rPr>
+          <w:rtl w:val="0"/>
+        </w:rPr>
+      </w:r>
+    </w:p>
+    <w:p>
+      <w:pPr>
+        <w:jc w:val="center"/>
+        <w:rPr/>
+      </w:pPr>
+      <w:r>
+        <w:rPr/>
+        <w:drawing>
+          <wp:inline distB="114300" distT="114300" distL="114300" distR="114300">
+            <wp:extent cx="5378288" cy="3247443"/>
+            <wp:effectExtent b="0" l="0" r="0" t="0"/>
+            <wp:docPr id="4" name="image7.png"/>
+            <a:graphic>
+              <a:graphicData uri="http://schemas.openxmlformats.org/drawingml/2006/picture">
+                <pic:pic>
+                  <pic:nvPicPr>
+                    <pic:cNvPr id="0" name="image7.png"/>
+                    <pic:cNvPicPr preferRelativeResize="0"/>
+                  </pic:nvPicPr>
+                  <pic:blipFill>
+                    <a:blip r:embed="rId26"/>
+                    <a:srcRect b="0" l="0" r="0" t="0"/>
+                    <a:stretch>
+                      <a:fillRect/>
+                    </a:stretch>
+                  </pic:blipFill>
+                  <pic:spPr>
+                    <a:xfrm>
+                      <a:off x="0" y="0"/>
+                      <a:ext cx="5378288" cy="3247443"/>
+                    </a:xfrm>
+                    <a:prstGeom prst="rect"/>
+                    <a:ln/>
+                  </pic:spPr>
+                </pic:pic>
+              </a:graphicData>
+            </a:graphic>
+          </wp:inline>
+        </w:drawing>
+      </w:r>
+      <w:r>
+        <w:rPr>
+          <w:rtl w:val="0"/>
+        </w:rPr>
+      </w:r>
+    </w:p>
+    <w:p>
+      <w:pPr>
+        <w:jc w:val="center"/>
+        <w:rPr/>
+      </w:pPr>
+      <w:r>
+        <w:rPr>
+          <w:i w:val="1"/>
+          <w:iCs w:val="1"/>
+          <w:sz w:val="18"/>
+          <w:szCs w:val="18"/>
+          <w:rtl w:val="0"/>
+        </w:rPr>
+        <w:t xml:space="preserve">Slika 20 - Get i Post metode EventController klase</w:t>
+      </w:r>
+      <w:r>
+        <w:rPr>
+          <w:rtl w:val="0"/>
+        </w:rPr>
+      </w:r>
+    </w:p>
+    <w:p>
+      <w:pPr>
+        <w:rPr/>
+      </w:pPr>
+      <w:r>
+        <w:rPr/>
+        <w:drawing>
+          <wp:inline distB="114300" distT="114300" distL="114300" distR="114300">
+            <wp:extent cx="5538788" cy="1435300"/>
+            <wp:effectExtent b="0" l="0" r="0" t="0"/>
+            <wp:docPr id="14" name="image5.png"/>
+            <a:graphic>
+              <a:graphicData uri="http://schemas.openxmlformats.org/drawingml/2006/picture">
+                <pic:pic>
+                  <pic:nvPicPr>
+                    <pic:cNvPr id="0" name="image5.png"/>
+                    <pic:cNvPicPr preferRelativeResize="0"/>
+                  </pic:nvPicPr>
+                  <pic:blipFill>
+                    <a:blip r:embed="rId27"/>
+                    <a:srcRect b="0" l="0" r="0" t="0"/>
+                    <a:stretch>
+                      <a:fillRect/>
+                    </a:stretch>
+                  </pic:blipFill>
+                  <pic:spPr>
+                    <a:xfrm>
+                      <a:off x="0" y="0"/>
+                      <a:ext cx="5538788" cy="1435300"/>
+                    </a:xfrm>
+                    <a:prstGeom prst="rect"/>
+                    <a:ln/>
+                  </pic:spPr>
+                </pic:pic>
+              </a:graphicData>
+            </a:graphic>
+          </wp:inline>
+        </w:drawing>
+      </w:r>
+      <w:r>
+        <w:rPr>
+          <w:rtl w:val="0"/>
+        </w:rPr>
+      </w:r>
+    </w:p>
+    <w:p>
+      <w:pPr>
+        <w:jc w:val="center"/>
+        <w:rPr>
+          <w:i w:val="1"/>
+          <w:iCs w:val="1"/>
+          <w:sz w:val="18"/>
+          <w:szCs w:val="18"/>
+        </w:rPr>
+      </w:pPr>
+      <w:r>
+        <w:rPr>
+          <w:i w:val="1"/>
+          <w:iCs w:val="1"/>
+          <w:sz w:val="18"/>
+          <w:szCs w:val="18"/>
+          <w:rtl w:val="0"/>
+        </w:rPr>
+        <w:t xml:space="preserve">Slika 21 - Post metoda CommentController klase</w:t>
+      </w:r>
+    </w:p>
+    <w:p>
+      <w:pPr>
+        <w:pStyle w:val="Heading1"/>
+        <w:numPr>
+          <w:ilvl w:val="0"/>
+          <w:numId w:val="8"/>
+        </w:numPr>
+        <w:rPr>
+          <w:u w:val="none"/>
+        </w:rPr>
+      </w:pPr>
+      <w:bookmarkStart w:colFirst="0" w:colLast="0" w:name="_t03ilgebu7u7" w:id="16"/>
+      <w:bookmarkEnd w:id="16"/>
+      <w:r>
+        <w:rPr>
+          <w:rtl w:val="0"/>
+        </w:rPr>
+        <w:t xml:space="preserve">Zaključak</w:t>
+      </w:r>
+    </w:p>
+    <w:p>
+      <w:pPr>
+        <w:spacing w:after="240" w:before="240" w:lineRule="auto"/>
+        <w:rPr/>
+      </w:pPr>
+      <w:r>
+        <w:rPr>
+          <w:rtl w:val="0"/>
+        </w:rPr>
+        <w:t xml:space="preserve">Tokom realizacije projekta razvijena je web aplikacija za upravljanje događajima korišćenjem Spring Boot framework-a i MVC arhitekture. Aplikacija omogućava korisnicima pregled događaja, kreiranje i izmenu sopstvenih događaja, rezervaciju mesta i dodavanje komentara. Korisnički interfejs implementiran je pomoću Thymeleaf šablona, HTML-a i CSS-a, dok je poslovna logika organizovana kroz servisni sloj. Iako projekat ne koristi bazu podataka, implementirano in-memory čuvanje podataka omogućilo je simulaciju rada realnog informacionog sistema i pravilnu organizaciju backend komponenti. Projekat je doprineo boljem razumevanju rada Spring MVC arhitekture, povezivanja frontend i backend sloja, kao i organizacije web aplikacija u Javi. Takođe, aplikacija predstavlja dobru osnovu za buduća proširenja, poput integracije baze podataka, autentifikacije korisnika i REST API funkcionalnosti.</w:t>
+      </w:r>
+    </w:p>
+    <w:p>
+      <w:pPr>
+        <w:rPr/>
+      </w:pPr>
       <w:r>
         <w:rPr>
           <w:rtl w:val="0"/>
@@ -1168,6 +3782,666 @@
   <w:abstractNum w:abstractNumId="2">
     <w:lvl w:ilvl="0">
       <w:start w:val="1"/>
+      <w:numFmt w:val="bullet"/>
+      <w:lvlText w:val="●"/>
+      <w:lvlJc w:val="left"/>
+      <w:pPr>
+        <w:ind w:left="720" w:hanging="360"/>
+      </w:pPr>
+      <w:rPr>
+        <w:u w:val="none"/>
+      </w:rPr>
+    </w:lvl>
+    <w:lvl w:ilvl="1">
+      <w:start w:val="1"/>
+      <w:numFmt w:val="bullet"/>
+      <w:lvlText w:val="○"/>
+      <w:lvlJc w:val="left"/>
+      <w:pPr>
+        <w:ind w:left="1440" w:hanging="360"/>
+      </w:pPr>
+      <w:rPr>
+        <w:u w:val="none"/>
+      </w:rPr>
+    </w:lvl>
+    <w:lvl w:ilvl="2">
+      <w:start w:val="1"/>
+      <w:numFmt w:val="bullet"/>
+      <w:lvlText w:val="■"/>
+      <w:lvlJc w:val="left"/>
+      <w:pPr>
+        <w:ind w:left="2160" w:hanging="360"/>
+      </w:pPr>
+      <w:rPr>
+        <w:u w:val="none"/>
+      </w:rPr>
+    </w:lvl>
+    <w:lvl w:ilvl="3">
+      <w:start w:val="1"/>
+      <w:numFmt w:val="bullet"/>
+      <w:lvlText w:val="●"/>
+      <w:lvlJc w:val="left"/>
+      <w:pPr>
+        <w:ind w:left="2880" w:hanging="360"/>
+      </w:pPr>
+      <w:rPr>
+        <w:u w:val="none"/>
+      </w:rPr>
+    </w:lvl>
+    <w:lvl w:ilvl="4">
+      <w:start w:val="1"/>
+      <w:numFmt w:val="bullet"/>
+      <w:lvlText w:val="○"/>
+      <w:lvlJc w:val="left"/>
+      <w:pPr>
+        <w:ind w:left="3600" w:hanging="360"/>
+      </w:pPr>
+      <w:rPr>
+        <w:u w:val="none"/>
+      </w:rPr>
+    </w:lvl>
+    <w:lvl w:ilvl="5">
+      <w:start w:val="1"/>
+      <w:numFmt w:val="bullet"/>
+      <w:lvlText w:val="■"/>
+      <w:lvlJc w:val="left"/>
+      <w:pPr>
+        <w:ind w:left="4320" w:hanging="360"/>
+      </w:pPr>
+      <w:rPr>
+        <w:u w:val="none"/>
+      </w:rPr>
+    </w:lvl>
+    <w:lvl w:ilvl="6">
+      <w:start w:val="1"/>
+      <w:numFmt w:val="bullet"/>
+      <w:lvlText w:val="●"/>
+      <w:lvlJc w:val="left"/>
+      <w:pPr>
+        <w:ind w:left="5040" w:hanging="360"/>
+      </w:pPr>
+      <w:rPr>
+        <w:u w:val="none"/>
+      </w:rPr>
+    </w:lvl>
+    <w:lvl w:ilvl="7">
+      <w:start w:val="1"/>
+      <w:numFmt w:val="bullet"/>
+      <w:lvlText w:val="○"/>
+      <w:lvlJc w:val="left"/>
+      <w:pPr>
+        <w:ind w:left="5760" w:hanging="360"/>
+      </w:pPr>
+      <w:rPr>
+        <w:u w:val="none"/>
+      </w:rPr>
+    </w:lvl>
+    <w:lvl w:ilvl="8">
+      <w:start w:val="1"/>
+      <w:numFmt w:val="bullet"/>
+      <w:lvlText w:val="■"/>
+      <w:lvlJc w:val="left"/>
+      <w:pPr>
+        <w:ind w:left="6480" w:hanging="360"/>
+      </w:pPr>
+      <w:rPr>
+        <w:u w:val="none"/>
+      </w:rPr>
+    </w:lvl>
+  </w:abstractNum>
+  <w:abstractNum w:abstractNumId="3">
+    <w:lvl w:ilvl="0">
+      <w:start w:val="1"/>
+      <w:numFmt w:val="bullet"/>
+      <w:lvlText w:val="●"/>
+      <w:lvlJc w:val="left"/>
+      <w:pPr>
+        <w:ind w:left="720" w:hanging="360"/>
+      </w:pPr>
+      <w:rPr>
+        <w:u w:val="none"/>
+      </w:rPr>
+    </w:lvl>
+    <w:lvl w:ilvl="1">
+      <w:start w:val="1"/>
+      <w:numFmt w:val="bullet"/>
+      <w:lvlText w:val="○"/>
+      <w:lvlJc w:val="left"/>
+      <w:pPr>
+        <w:ind w:left="1440" w:hanging="360"/>
+      </w:pPr>
+      <w:rPr>
+        <w:u w:val="none"/>
+      </w:rPr>
+    </w:lvl>
+    <w:lvl w:ilvl="2">
+      <w:start w:val="1"/>
+      <w:numFmt w:val="bullet"/>
+      <w:lvlText w:val="■"/>
+      <w:lvlJc w:val="left"/>
+      <w:pPr>
+        <w:ind w:left="2160" w:hanging="360"/>
+      </w:pPr>
+      <w:rPr>
+        <w:u w:val="none"/>
+      </w:rPr>
+    </w:lvl>
+    <w:lvl w:ilvl="3">
+      <w:start w:val="1"/>
+      <w:numFmt w:val="bullet"/>
+      <w:lvlText w:val="●"/>
+      <w:lvlJc w:val="left"/>
+      <w:pPr>
+        <w:ind w:left="2880" w:hanging="360"/>
+      </w:pPr>
+      <w:rPr>
+        <w:u w:val="none"/>
+      </w:rPr>
+    </w:lvl>
+    <w:lvl w:ilvl="4">
+      <w:start w:val="1"/>
+      <w:numFmt w:val="bullet"/>
+      <w:lvlText w:val="○"/>
+      <w:lvlJc w:val="left"/>
+      <w:pPr>
+        <w:ind w:left="3600" w:hanging="360"/>
+      </w:pPr>
+      <w:rPr>
+        <w:u w:val="none"/>
+      </w:rPr>
+    </w:lvl>
+    <w:lvl w:ilvl="5">
+      <w:start w:val="1"/>
+      <w:numFmt w:val="bullet"/>
+      <w:lvlText w:val="■"/>
+      <w:lvlJc w:val="left"/>
+      <w:pPr>
+        <w:ind w:left="4320" w:hanging="360"/>
+      </w:pPr>
+      <w:rPr>
+        <w:u w:val="none"/>
+      </w:rPr>
+    </w:lvl>
+    <w:lvl w:ilvl="6">
+      <w:start w:val="1"/>
+      <w:numFmt w:val="bullet"/>
+      <w:lvlText w:val="●"/>
+      <w:lvlJc w:val="left"/>
+      <w:pPr>
+        <w:ind w:left="5040" w:hanging="360"/>
+      </w:pPr>
+      <w:rPr>
+        <w:u w:val="none"/>
+      </w:rPr>
+    </w:lvl>
+    <w:lvl w:ilvl="7">
+      <w:start w:val="1"/>
+      <w:numFmt w:val="bullet"/>
+      <w:lvlText w:val="○"/>
+      <w:lvlJc w:val="left"/>
+      <w:pPr>
+        <w:ind w:left="5760" w:hanging="360"/>
+      </w:pPr>
+      <w:rPr>
+        <w:u w:val="none"/>
+      </w:rPr>
+    </w:lvl>
+    <w:lvl w:ilvl="8">
+      <w:start w:val="1"/>
+      <w:numFmt w:val="bullet"/>
+      <w:lvlText w:val="■"/>
+      <w:lvlJc w:val="left"/>
+      <w:pPr>
+        <w:ind w:left="6480" w:hanging="360"/>
+      </w:pPr>
+      <w:rPr>
+        <w:u w:val="none"/>
+      </w:rPr>
+    </w:lvl>
+  </w:abstractNum>
+  <w:abstractNum w:abstractNumId="4">
+    <w:lvl w:ilvl="0">
+      <w:start w:val="1"/>
+      <w:numFmt w:val="bullet"/>
+      <w:lvlText w:val="●"/>
+      <w:lvlJc w:val="left"/>
+      <w:pPr>
+        <w:ind w:left="720" w:hanging="360"/>
+      </w:pPr>
+      <w:rPr>
+        <w:u w:val="none"/>
+      </w:rPr>
+    </w:lvl>
+    <w:lvl w:ilvl="1">
+      <w:start w:val="1"/>
+      <w:numFmt w:val="bullet"/>
+      <w:lvlText w:val="○"/>
+      <w:lvlJc w:val="left"/>
+      <w:pPr>
+        <w:ind w:left="1440" w:hanging="360"/>
+      </w:pPr>
+      <w:rPr>
+        <w:u w:val="none"/>
+      </w:rPr>
+    </w:lvl>
+    <w:lvl w:ilvl="2">
+      <w:start w:val="1"/>
+      <w:numFmt w:val="bullet"/>
+      <w:lvlText w:val="■"/>
+      <w:lvlJc w:val="left"/>
+      <w:pPr>
+        <w:ind w:left="2160" w:hanging="360"/>
+      </w:pPr>
+      <w:rPr>
+        <w:u w:val="none"/>
+      </w:rPr>
+    </w:lvl>
+    <w:lvl w:ilvl="3">
+      <w:start w:val="1"/>
+      <w:numFmt w:val="bullet"/>
+      <w:lvlText w:val="●"/>
+      <w:lvlJc w:val="left"/>
+      <w:pPr>
+        <w:ind w:left="2880" w:hanging="360"/>
+      </w:pPr>
+      <w:rPr>
+        <w:u w:val="none"/>
+      </w:rPr>
+    </w:lvl>
+    <w:lvl w:ilvl="4">
+      <w:start w:val="1"/>
+      <w:numFmt w:val="bullet"/>
+      <w:lvlText w:val="○"/>
+      <w:lvlJc w:val="left"/>
+      <w:pPr>
+        <w:ind w:left="3600" w:hanging="360"/>
+      </w:pPr>
+      <w:rPr>
+        <w:u w:val="none"/>
+      </w:rPr>
+    </w:lvl>
+    <w:lvl w:ilvl="5">
+      <w:start w:val="1"/>
+      <w:numFmt w:val="bullet"/>
+      <w:lvlText w:val="■"/>
+      <w:lvlJc w:val="left"/>
+      <w:pPr>
+        <w:ind w:left="4320" w:hanging="360"/>
+      </w:pPr>
+      <w:rPr>
+        <w:u w:val="none"/>
+      </w:rPr>
+    </w:lvl>
+    <w:lvl w:ilvl="6">
+      <w:start w:val="1"/>
+      <w:numFmt w:val="bullet"/>
+      <w:lvlText w:val="●"/>
+      <w:lvlJc w:val="left"/>
+      <w:pPr>
+        <w:ind w:left="5040" w:hanging="360"/>
+      </w:pPr>
+      <w:rPr>
+        <w:u w:val="none"/>
+      </w:rPr>
+    </w:lvl>
+    <w:lvl w:ilvl="7">
+      <w:start w:val="1"/>
+      <w:numFmt w:val="bullet"/>
+      <w:lvlText w:val="○"/>
+      <w:lvlJc w:val="left"/>
+      <w:pPr>
+        <w:ind w:left="5760" w:hanging="360"/>
+      </w:pPr>
+      <w:rPr>
+        <w:u w:val="none"/>
+      </w:rPr>
+    </w:lvl>
+    <w:lvl w:ilvl="8">
+      <w:start w:val="1"/>
+      <w:numFmt w:val="bullet"/>
+      <w:lvlText w:val="■"/>
+      <w:lvlJc w:val="left"/>
+      <w:pPr>
+        <w:ind w:left="6480" w:hanging="360"/>
+      </w:pPr>
+      <w:rPr>
+        <w:u w:val="none"/>
+      </w:rPr>
+    </w:lvl>
+  </w:abstractNum>
+  <w:abstractNum w:abstractNumId="5">
+    <w:lvl w:ilvl="0">
+      <w:start w:val="1"/>
+      <w:numFmt w:val="bullet"/>
+      <w:lvlText w:val="●"/>
+      <w:lvlJc w:val="left"/>
+      <w:pPr>
+        <w:ind w:left="720" w:hanging="360"/>
+      </w:pPr>
+      <w:rPr>
+        <w:u w:val="none"/>
+      </w:rPr>
+    </w:lvl>
+    <w:lvl w:ilvl="1">
+      <w:start w:val="1"/>
+      <w:numFmt w:val="bullet"/>
+      <w:lvlText w:val="○"/>
+      <w:lvlJc w:val="left"/>
+      <w:pPr>
+        <w:ind w:left="1440" w:hanging="360"/>
+      </w:pPr>
+      <w:rPr>
+        <w:u w:val="none"/>
+      </w:rPr>
+    </w:lvl>
+    <w:lvl w:ilvl="2">
+      <w:start w:val="1"/>
+      <w:numFmt w:val="bullet"/>
+      <w:lvlText w:val="■"/>
+      <w:lvlJc w:val="left"/>
+      <w:pPr>
+        <w:ind w:left="2160" w:hanging="360"/>
+      </w:pPr>
+      <w:rPr>
+        <w:u w:val="none"/>
+      </w:rPr>
+    </w:lvl>
+    <w:lvl w:ilvl="3">
+      <w:start w:val="1"/>
+      <w:numFmt w:val="bullet"/>
+      <w:lvlText w:val="●"/>
+      <w:lvlJc w:val="left"/>
+      <w:pPr>
+        <w:ind w:left="2880" w:hanging="360"/>
+      </w:pPr>
+      <w:rPr>
+        <w:u w:val="none"/>
+      </w:rPr>
+    </w:lvl>
+    <w:lvl w:ilvl="4">
+      <w:start w:val="1"/>
+      <w:numFmt w:val="bullet"/>
+      <w:lvlText w:val="○"/>
+      <w:lvlJc w:val="left"/>
+      <w:pPr>
+        <w:ind w:left="3600" w:hanging="360"/>
+      </w:pPr>
+      <w:rPr>
+        <w:u w:val="none"/>
+      </w:rPr>
+    </w:lvl>
+    <w:lvl w:ilvl="5">
+      <w:start w:val="1"/>
+      <w:numFmt w:val="bullet"/>
+      <w:lvlText w:val="■"/>
+      <w:lvlJc w:val="left"/>
+      <w:pPr>
+        <w:ind w:left="4320" w:hanging="360"/>
+      </w:pPr>
+      <w:rPr>
+        <w:u w:val="none"/>
+      </w:rPr>
+    </w:lvl>
+    <w:lvl w:ilvl="6">
+      <w:start w:val="1"/>
+      <w:numFmt w:val="bullet"/>
+      <w:lvlText w:val="●"/>
+      <w:lvlJc w:val="left"/>
+      <w:pPr>
+        <w:ind w:left="5040" w:hanging="360"/>
+      </w:pPr>
+      <w:rPr>
+        <w:u w:val="none"/>
+      </w:rPr>
+    </w:lvl>
+    <w:lvl w:ilvl="7">
+      <w:start w:val="1"/>
+      <w:numFmt w:val="bullet"/>
+      <w:lvlText w:val="○"/>
+      <w:lvlJc w:val="left"/>
+      <w:pPr>
+        <w:ind w:left="5760" w:hanging="360"/>
+      </w:pPr>
+      <w:rPr>
+        <w:u w:val="none"/>
+      </w:rPr>
+    </w:lvl>
+    <w:lvl w:ilvl="8">
+      <w:start w:val="1"/>
+      <w:numFmt w:val="bullet"/>
+      <w:lvlText w:val="■"/>
+      <w:lvlJc w:val="left"/>
+      <w:pPr>
+        <w:ind w:left="6480" w:hanging="360"/>
+      </w:pPr>
+      <w:rPr>
+        <w:u w:val="none"/>
+      </w:rPr>
+    </w:lvl>
+  </w:abstractNum>
+  <w:abstractNum w:abstractNumId="6">
+    <w:lvl w:ilvl="0">
+      <w:start w:val="1"/>
+      <w:numFmt w:val="bullet"/>
+      <w:lvlText w:val="●"/>
+      <w:lvlJc w:val="left"/>
+      <w:pPr>
+        <w:ind w:left="720" w:hanging="360"/>
+      </w:pPr>
+      <w:rPr>
+        <w:u w:val="none"/>
+      </w:rPr>
+    </w:lvl>
+    <w:lvl w:ilvl="1">
+      <w:start w:val="1"/>
+      <w:numFmt w:val="bullet"/>
+      <w:lvlText w:val="○"/>
+      <w:lvlJc w:val="left"/>
+      <w:pPr>
+        <w:ind w:left="1440" w:hanging="360"/>
+      </w:pPr>
+      <w:rPr>
+        <w:u w:val="none"/>
+      </w:rPr>
+    </w:lvl>
+    <w:lvl w:ilvl="2">
+      <w:start w:val="1"/>
+      <w:numFmt w:val="bullet"/>
+      <w:lvlText w:val="■"/>
+      <w:lvlJc w:val="left"/>
+      <w:pPr>
+        <w:ind w:left="2160" w:hanging="360"/>
+      </w:pPr>
+      <w:rPr>
+        <w:u w:val="none"/>
+      </w:rPr>
+    </w:lvl>
+    <w:lvl w:ilvl="3">
+      <w:start w:val="1"/>
+      <w:numFmt w:val="bullet"/>
+      <w:lvlText w:val="●"/>
+      <w:lvlJc w:val="left"/>
+      <w:pPr>
+        <w:ind w:left="2880" w:hanging="360"/>
+      </w:pPr>
+      <w:rPr>
+        <w:u w:val="none"/>
+      </w:rPr>
+    </w:lvl>
+    <w:lvl w:ilvl="4">
+      <w:start w:val="1"/>
+      <w:numFmt w:val="bullet"/>
+      <w:lvlText w:val="○"/>
+      <w:lvlJc w:val="left"/>
+      <w:pPr>
+        <w:ind w:left="3600" w:hanging="360"/>
+      </w:pPr>
+      <w:rPr>
+        <w:u w:val="none"/>
+      </w:rPr>
+    </w:lvl>
+    <w:lvl w:ilvl="5">
+      <w:start w:val="1"/>
+      <w:numFmt w:val="bullet"/>
+      <w:lvlText w:val="■"/>
+      <w:lvlJc w:val="left"/>
+      <w:pPr>
+        <w:ind w:left="4320" w:hanging="360"/>
+      </w:pPr>
+      <w:rPr>
+        <w:u w:val="none"/>
+      </w:rPr>
+    </w:lvl>
+    <w:lvl w:ilvl="6">
+      <w:start w:val="1"/>
+      <w:numFmt w:val="bullet"/>
+      <w:lvlText w:val="●"/>
+      <w:lvlJc w:val="left"/>
+      <w:pPr>
+        <w:ind w:left="5040" w:hanging="360"/>
+      </w:pPr>
+      <w:rPr>
+        <w:u w:val="none"/>
+      </w:rPr>
+    </w:lvl>
+    <w:lvl w:ilvl="7">
+      <w:start w:val="1"/>
+      <w:numFmt w:val="bullet"/>
+      <w:lvlText w:val="○"/>
+      <w:lvlJc w:val="left"/>
+      <w:pPr>
+        <w:ind w:left="5760" w:hanging="360"/>
+      </w:pPr>
+      <w:rPr>
+        <w:u w:val="none"/>
+      </w:rPr>
+    </w:lvl>
+    <w:lvl w:ilvl="8">
+      <w:start w:val="1"/>
+      <w:numFmt w:val="bullet"/>
+      <w:lvlText w:val="■"/>
+      <w:lvlJc w:val="left"/>
+      <w:pPr>
+        <w:ind w:left="6480" w:hanging="360"/>
+      </w:pPr>
+      <w:rPr>
+        <w:u w:val="none"/>
+      </w:rPr>
+    </w:lvl>
+  </w:abstractNum>
+  <w:abstractNum w:abstractNumId="7">
+    <w:lvl w:ilvl="0">
+      <w:start w:val="1"/>
+      <w:numFmt w:val="bullet"/>
+      <w:lvlText w:val="●"/>
+      <w:lvlJc w:val="left"/>
+      <w:pPr>
+        <w:ind w:left="720" w:hanging="360"/>
+      </w:pPr>
+      <w:rPr>
+        <w:u w:val="none"/>
+      </w:rPr>
+    </w:lvl>
+    <w:lvl w:ilvl="1">
+      <w:start w:val="1"/>
+      <w:numFmt w:val="bullet"/>
+      <w:lvlText w:val="○"/>
+      <w:lvlJc w:val="left"/>
+      <w:pPr>
+        <w:ind w:left="1440" w:hanging="360"/>
+      </w:pPr>
+      <w:rPr>
+        <w:u w:val="none"/>
+      </w:rPr>
+    </w:lvl>
+    <w:lvl w:ilvl="2">
+      <w:start w:val="1"/>
+      <w:numFmt w:val="bullet"/>
+      <w:lvlText w:val="■"/>
+      <w:lvlJc w:val="left"/>
+      <w:pPr>
+        <w:ind w:left="2160" w:hanging="360"/>
+      </w:pPr>
+      <w:rPr>
+        <w:u w:val="none"/>
+      </w:rPr>
+    </w:lvl>
+    <w:lvl w:ilvl="3">
+      <w:start w:val="1"/>
+      <w:numFmt w:val="bullet"/>
+      <w:lvlText w:val="●"/>
+      <w:lvlJc w:val="left"/>
+      <w:pPr>
+        <w:ind w:left="2880" w:hanging="360"/>
+      </w:pPr>
+      <w:rPr>
+        <w:u w:val="none"/>
+      </w:rPr>
+    </w:lvl>
+    <w:lvl w:ilvl="4">
+      <w:start w:val="1"/>
+      <w:numFmt w:val="bullet"/>
+      <w:lvlText w:val="○"/>
+      <w:lvlJc w:val="left"/>
+      <w:pPr>
+        <w:ind w:left="3600" w:hanging="360"/>
+      </w:pPr>
+      <w:rPr>
+        <w:u w:val="none"/>
+      </w:rPr>
+    </w:lvl>
+    <w:lvl w:ilvl="5">
+      <w:start w:val="1"/>
+      <w:numFmt w:val="bullet"/>
+      <w:lvlText w:val="■"/>
+      <w:lvlJc w:val="left"/>
+      <w:pPr>
+        <w:ind w:left="4320" w:hanging="360"/>
+      </w:pPr>
+      <w:rPr>
+        <w:u w:val="none"/>
+      </w:rPr>
+    </w:lvl>
+    <w:lvl w:ilvl="6">
+      <w:start w:val="1"/>
+      <w:numFmt w:val="bullet"/>
+      <w:lvlText w:val="●"/>
+      <w:lvlJc w:val="left"/>
+      <w:pPr>
+        <w:ind w:left="5040" w:hanging="360"/>
+      </w:pPr>
+      <w:rPr>
+        <w:u w:val="none"/>
+      </w:rPr>
+    </w:lvl>
+    <w:lvl w:ilvl="7">
+      <w:start w:val="1"/>
+      <w:numFmt w:val="bullet"/>
+      <w:lvlText w:val="○"/>
+      <w:lvlJc w:val="left"/>
+      <w:pPr>
+        <w:ind w:left="5760" w:hanging="360"/>
+      </w:pPr>
+      <w:rPr>
+        <w:u w:val="none"/>
+      </w:rPr>
+    </w:lvl>
+    <w:lvl w:ilvl="8">
+      <w:start w:val="1"/>
+      <w:numFmt w:val="bullet"/>
+      <w:lvlText w:val="■"/>
+      <w:lvlJc w:val="left"/>
+      <w:pPr>
+        <w:ind w:left="6480" w:hanging="360"/>
+      </w:pPr>
+      <w:rPr>
+        <w:u w:val="none"/>
+      </w:rPr>
+    </w:lvl>
+  </w:abstractNum>
+  <w:abstractNum w:abstractNumId="8">
+    <w:lvl w:ilvl="0">
+      <w:start w:val="1"/>
       <w:numFmt w:val="decimal"/>
       <w:lvlText w:val="%1."/>
       <w:lvlJc w:val="left"/>
@@ -1280,6 +4554,24 @@
   </w:num>
   <w:num w:numId="2">
     <w:abstractNumId w:val="2"/>
+  </w:num>
+  <w:num w:numId="3">
+    <w:abstractNumId w:val="3"/>
+  </w:num>
+  <w:num w:numId="4">
+    <w:abstractNumId w:val="4"/>
+  </w:num>
+  <w:num w:numId="5">
+    <w:abstractNumId w:val="5"/>
+  </w:num>
+  <w:num w:numId="6">
+    <w:abstractNumId w:val="6"/>
+  </w:num>
+  <w:num w:numId="7">
+    <w:abstractNumId w:val="7"/>
+  </w:num>
+  <w:num w:numId="8">
+    <w:abstractNumId w:val="8"/>
   </w:num>
 </w:numbering>
 </file>
@@ -1296,7 +4588,8 @@
     </w:rPrDefault>
     <w:pPrDefault>
       <w:pPr>
-        <w:spacing w:line="276" w:lineRule="auto"/>
+        <w:spacing w:before="200" w:line="276" w:lineRule="auto"/>
+        <w:jc w:val="both"/>
       </w:pPr>
     </w:pPrDefault>
   </w:docDefaults>

</xml_diff>

<commit_message>
Update table of contents for documentation
</commit_message>
<xml_diff>
--- a/Documentation/IT355-P01-AleksandraMarković6305.docx
+++ b/Documentation/IT355-P01-AleksandraMarković6305.docx
@@ -50,12 +50,12 @@
           <wp:inline distB="114300" distT="114300" distL="114300" distR="114300">
             <wp:extent cx="2425700" cy="1968500"/>
             <wp:effectExtent b="0" l="0" r="0" t="0"/>
-            <wp:docPr descr="Description: LOGO_bela_pozadina" id="18" name="image8.png"/>
+            <wp:docPr descr="Description: LOGO_bela_pozadina" id="18" name="image12.png"/>
             <a:graphic>
               <a:graphicData uri="http://schemas.openxmlformats.org/drawingml/2006/picture">
                 <pic:pic>
                   <pic:nvPicPr>
-                    <pic:cNvPr descr="Description: LOGO_bela_pozadina" id="0" name="image8.png"/>
+                    <pic:cNvPr descr="Description: LOGO_bela_pozadina" id="0" name="image12.png"/>
                     <pic:cNvPicPr preferRelativeResize="0"/>
                   </pic:nvPicPr>
                   <pic:blipFill>
@@ -662,6 +662,801 @@
           <w:sz w:val="28"/>
           <w:szCs w:val="28"/>
         </w:rPr>
+      </w:pPr>
+      <w:r>
+        <w:rPr>
+          <w:rFonts w:ascii="Times New Roman" w:cs="Times New Roman" w:eastAsia="Times New Roman" w:hAnsi="Times New Roman"/>
+          <w:b w:val="1"/>
+          <w:bCs w:val="1"/>
+          <w:sz w:val="28"/>
+          <w:szCs w:val="28"/>
+          <w:rtl w:val="0"/>
+        </w:rPr>
+        <w:t xml:space="preserve">Sadržaj</w:t>
+      </w:r>
+    </w:p>
+    <w:sdt>
+      <w:sdtPr>
+        <w:id w:val="-541952084"/>
+        <w:docPartObj>
+          <w:docPartGallery w:val="Table of Contents"/>
+          <w:docPartUnique w:val="1"/>
+        </w:docPartObj>
+      </w:sdtPr>
+      <w:sdtContent>
+        <w:p>
+          <w:pPr>
+            <w:widowControl w:val="0"/>
+            <w:tabs>
+              <w:tab w:val="right" w:leader="none" w:pos="9025.511811023624"/>
+            </w:tabs>
+            <w:spacing w:before="60" w:line="240" w:lineRule="auto"/>
+            <w:jc w:val="left"/>
+            <w:rPr>
+              <w:b w:val="1"/>
+              <w:bCs w:val="1"/>
+              <w:color w:val="000000"/>
+              <w:u w:val="none"/>
+            </w:rPr>
+          </w:pPr>
+          <w:r>
+            <w:fldChar w:fldCharType="begin"/>
+            <w:instrText xml:space="preserve"> TOC \h \u \z \t "Heading 1,1,Heading 2,2,Heading 3,3,Heading 4,4,Heading 5,5,Heading 6,6,"</w:instrText>
+            <w:fldChar w:fldCharType="separate"/>
+          </w:r>
+          <w:hyperlink w:anchor="_jltc2gf1h871">
+            <w:r>
+              <w:rPr>
+                <w:b w:val="1"/>
+                <w:bCs w:val="1"/>
+                <w:color w:val="000000"/>
+                <w:u w:val="none"/>
+                <w:rtl w:val="0"/>
+              </w:rPr>
+              <w:t xml:space="preserve">1. Uvod</w:t>
+              <w:tab/>
+            </w:r>
+          </w:hyperlink>
+          <w:r>
+            <w:fldChar w:fldCharType="begin"/>
+            <w:instrText xml:space="preserve"> PAGEREF _jltc2gf1h871 \h </w:instrText>
+            <w:fldChar w:fldCharType="separate"/>
+          </w:r>
+          <w:r>
+            <w:rPr>
+              <w:b w:val="1"/>
+              <w:bCs w:val="1"/>
+              <w:rtl w:val="0"/>
+            </w:rPr>
+            <w:t xml:space="preserve">3</w:t>
+          </w:r>
+          <w:r>
+            <w:fldChar w:fldCharType="end"/>
+          </w:r>
+          <w:r>
+            <w:rPr>
+              <w:rtl w:val="0"/>
+            </w:rPr>
+          </w:r>
+        </w:p>
+        <w:p>
+          <w:pPr>
+            <w:widowControl w:val="0"/>
+            <w:tabs>
+              <w:tab w:val="right" w:leader="none" w:pos="9025.511811023624"/>
+            </w:tabs>
+            <w:spacing w:before="60" w:line="240" w:lineRule="auto"/>
+            <w:jc w:val="left"/>
+            <w:rPr>
+              <w:b w:val="1"/>
+              <w:bCs w:val="1"/>
+              <w:color w:val="000000"/>
+              <w:u w:val="none"/>
+            </w:rPr>
+          </w:pPr>
+          <w:hyperlink w:anchor="_mrl6fp9ba79n">
+            <w:r>
+              <w:rPr>
+                <w:b w:val="1"/>
+                <w:bCs w:val="1"/>
+                <w:color w:val="000000"/>
+                <w:u w:val="none"/>
+                <w:rtl w:val="0"/>
+              </w:rPr>
+              <w:t xml:space="preserve">2. Planiranje i dizajn sistema</w:t>
+              <w:tab/>
+            </w:r>
+          </w:hyperlink>
+          <w:r>
+            <w:fldChar w:fldCharType="begin"/>
+            <w:instrText xml:space="preserve"> PAGEREF _mrl6fp9ba79n \h </w:instrText>
+            <w:fldChar w:fldCharType="separate"/>
+          </w:r>
+          <w:r>
+            <w:rPr>
+              <w:b w:val="1"/>
+              <w:bCs w:val="1"/>
+              <w:rtl w:val="0"/>
+            </w:rPr>
+            <w:t xml:space="preserve">4</w:t>
+          </w:r>
+          <w:r>
+            <w:fldChar w:fldCharType="end"/>
+          </w:r>
+          <w:r>
+            <w:rPr>
+              <w:rtl w:val="0"/>
+            </w:rPr>
+          </w:r>
+        </w:p>
+        <w:p>
+          <w:pPr>
+            <w:widowControl w:val="0"/>
+            <w:tabs>
+              <w:tab w:val="right" w:leader="none" w:pos="9025.511811023624"/>
+            </w:tabs>
+            <w:spacing w:before="60" w:line="240" w:lineRule="auto"/>
+            <w:ind w:left="360" w:firstLine="0"/>
+            <w:jc w:val="left"/>
+            <w:rPr>
+              <w:color w:val="000000"/>
+              <w:u w:val="none"/>
+            </w:rPr>
+          </w:pPr>
+          <w:hyperlink w:anchor="_wskpqvkx8r1t">
+            <w:r>
+              <w:rPr>
+                <w:color w:val="000000"/>
+                <w:u w:val="none"/>
+                <w:rtl w:val="0"/>
+              </w:rPr>
+              <w:t xml:space="preserve">2.1. Definicija zahteva</w:t>
+              <w:tab/>
+            </w:r>
+          </w:hyperlink>
+          <w:r>
+            <w:fldChar w:fldCharType="begin"/>
+            <w:instrText xml:space="preserve"> PAGEREF _wskpqvkx8r1t \h </w:instrText>
+            <w:fldChar w:fldCharType="separate"/>
+          </w:r>
+          <w:r>
+            <w:rPr>
+              <w:rtl w:val="0"/>
+            </w:rPr>
+            <w:t xml:space="preserve">4</w:t>
+          </w:r>
+          <w:r>
+            <w:fldChar w:fldCharType="end"/>
+          </w:r>
+          <w:r>
+            <w:rPr>
+              <w:rtl w:val="0"/>
+            </w:rPr>
+          </w:r>
+        </w:p>
+        <w:p>
+          <w:pPr>
+            <w:widowControl w:val="0"/>
+            <w:tabs>
+              <w:tab w:val="right" w:leader="none" w:pos="9025.511811023624"/>
+            </w:tabs>
+            <w:spacing w:before="60" w:line="240" w:lineRule="auto"/>
+            <w:ind w:left="360" w:firstLine="0"/>
+            <w:jc w:val="left"/>
+            <w:rPr>
+              <w:color w:val="000000"/>
+              <w:u w:val="none"/>
+            </w:rPr>
+          </w:pPr>
+          <w:hyperlink w:anchor="_ihvv9bmhka2q">
+            <w:r>
+              <w:rPr>
+                <w:color w:val="000000"/>
+                <w:u w:val="none"/>
+                <w:rtl w:val="0"/>
+              </w:rPr>
+              <w:t xml:space="preserve">2.2. Use case dijagram</w:t>
+              <w:tab/>
+            </w:r>
+          </w:hyperlink>
+          <w:r>
+            <w:fldChar w:fldCharType="begin"/>
+            <w:instrText xml:space="preserve"> PAGEREF _ihvv9bmhka2q \h </w:instrText>
+            <w:fldChar w:fldCharType="separate"/>
+          </w:r>
+          <w:r>
+            <w:rPr>
+              <w:rtl w:val="0"/>
+            </w:rPr>
+            <w:t xml:space="preserve">4</w:t>
+          </w:r>
+          <w:r>
+            <w:fldChar w:fldCharType="end"/>
+          </w:r>
+          <w:r>
+            <w:rPr>
+              <w:rtl w:val="0"/>
+            </w:rPr>
+          </w:r>
+        </w:p>
+        <w:p>
+          <w:pPr>
+            <w:widowControl w:val="0"/>
+            <w:tabs>
+              <w:tab w:val="right" w:leader="none" w:pos="9025.511811023624"/>
+            </w:tabs>
+            <w:spacing w:before="60" w:line="240" w:lineRule="auto"/>
+            <w:jc w:val="left"/>
+            <w:rPr>
+              <w:b w:val="1"/>
+              <w:bCs w:val="1"/>
+              <w:color w:val="000000"/>
+              <w:u w:val="none"/>
+            </w:rPr>
+          </w:pPr>
+          <w:hyperlink w:anchor="_z3e8lbmd54qv">
+            <w:r>
+              <w:rPr>
+                <w:b w:val="1"/>
+                <w:bCs w:val="1"/>
+                <w:color w:val="000000"/>
+                <w:u w:val="none"/>
+                <w:rtl w:val="0"/>
+              </w:rPr>
+              <w:t xml:space="preserve">3. Razvoj korisničkog interfejsa</w:t>
+              <w:tab/>
+            </w:r>
+          </w:hyperlink>
+          <w:r>
+            <w:fldChar w:fldCharType="begin"/>
+            <w:instrText xml:space="preserve"> PAGEREF _z3e8lbmd54qv \h </w:instrText>
+            <w:fldChar w:fldCharType="separate"/>
+          </w:r>
+          <w:r>
+            <w:rPr>
+              <w:b w:val="1"/>
+              <w:bCs w:val="1"/>
+              <w:rtl w:val="0"/>
+            </w:rPr>
+            <w:t xml:space="preserve">6</w:t>
+          </w:r>
+          <w:r>
+            <w:fldChar w:fldCharType="end"/>
+          </w:r>
+          <w:r>
+            <w:rPr>
+              <w:rtl w:val="0"/>
+            </w:rPr>
+          </w:r>
+        </w:p>
+        <w:p>
+          <w:pPr>
+            <w:widowControl w:val="0"/>
+            <w:tabs>
+              <w:tab w:val="right" w:leader="none" w:pos="9025.511811023624"/>
+            </w:tabs>
+            <w:spacing w:before="60" w:line="240" w:lineRule="auto"/>
+            <w:ind w:left="360" w:firstLine="0"/>
+            <w:jc w:val="left"/>
+            <w:rPr>
+              <w:color w:val="000000"/>
+              <w:u w:val="none"/>
+            </w:rPr>
+          </w:pPr>
+          <w:hyperlink w:anchor="_mc1n4g9tc5p1">
+            <w:r>
+              <w:rPr>
+                <w:color w:val="000000"/>
+                <w:u w:val="none"/>
+                <w:rtl w:val="0"/>
+              </w:rPr>
+              <w:t xml:space="preserve">3.1. Pregled ključnih stranica</w:t>
+              <w:tab/>
+            </w:r>
+          </w:hyperlink>
+          <w:r>
+            <w:fldChar w:fldCharType="begin"/>
+            <w:instrText xml:space="preserve"> PAGEREF _mc1n4g9tc5p1 \h </w:instrText>
+            <w:fldChar w:fldCharType="separate"/>
+          </w:r>
+          <w:r>
+            <w:rPr>
+              <w:rtl w:val="0"/>
+            </w:rPr>
+            <w:t xml:space="preserve">7</w:t>
+          </w:r>
+          <w:r>
+            <w:fldChar w:fldCharType="end"/>
+          </w:r>
+          <w:r>
+            <w:rPr>
+              <w:rtl w:val="0"/>
+            </w:rPr>
+          </w:r>
+        </w:p>
+        <w:p>
+          <w:pPr>
+            <w:widowControl w:val="0"/>
+            <w:tabs>
+              <w:tab w:val="right" w:leader="none" w:pos="9025.511811023624"/>
+            </w:tabs>
+            <w:spacing w:before="60" w:line="240" w:lineRule="auto"/>
+            <w:ind w:left="720" w:firstLine="0"/>
+            <w:jc w:val="left"/>
+            <w:rPr>
+              <w:color w:val="000000"/>
+              <w:u w:val="none"/>
+            </w:rPr>
+          </w:pPr>
+          <w:hyperlink w:anchor="_q9m8zuoz8fen">
+            <w:r>
+              <w:rPr>
+                <w:color w:val="000000"/>
+                <w:u w:val="none"/>
+                <w:rtl w:val="0"/>
+              </w:rPr>
+              <w:t xml:space="preserve">3.1.1. Login</w:t>
+              <w:tab/>
+            </w:r>
+          </w:hyperlink>
+          <w:r>
+            <w:fldChar w:fldCharType="begin"/>
+            <w:instrText xml:space="preserve"> PAGEREF _q9m8zuoz8fen \h </w:instrText>
+            <w:fldChar w:fldCharType="separate"/>
+          </w:r>
+          <w:r>
+            <w:rPr>
+              <w:rtl w:val="0"/>
+            </w:rPr>
+            <w:t xml:space="preserve">7</w:t>
+          </w:r>
+          <w:r>
+            <w:fldChar w:fldCharType="end"/>
+          </w:r>
+          <w:r>
+            <w:rPr>
+              <w:rtl w:val="0"/>
+            </w:rPr>
+          </w:r>
+        </w:p>
+        <w:p>
+          <w:pPr>
+            <w:widowControl w:val="0"/>
+            <w:tabs>
+              <w:tab w:val="right" w:leader="none" w:pos="9025.511811023624"/>
+            </w:tabs>
+            <w:spacing w:before="60" w:line="240" w:lineRule="auto"/>
+            <w:ind w:left="720" w:firstLine="0"/>
+            <w:jc w:val="left"/>
+            <w:rPr>
+              <w:color w:val="000000"/>
+              <w:u w:val="none"/>
+            </w:rPr>
+          </w:pPr>
+          <w:hyperlink w:anchor="_jr8czs1yoyuf">
+            <w:r>
+              <w:rPr>
+                <w:color w:val="000000"/>
+                <w:u w:val="none"/>
+                <w:rtl w:val="0"/>
+              </w:rPr>
+              <w:t xml:space="preserve">3.1.2. Events</w:t>
+              <w:tab/>
+            </w:r>
+          </w:hyperlink>
+          <w:r>
+            <w:fldChar w:fldCharType="begin"/>
+            <w:instrText xml:space="preserve"> PAGEREF _jr8czs1yoyuf \h </w:instrText>
+            <w:fldChar w:fldCharType="separate"/>
+          </w:r>
+          <w:r>
+            <w:rPr>
+              <w:rtl w:val="0"/>
+            </w:rPr>
+            <w:t xml:space="preserve">8</w:t>
+          </w:r>
+          <w:r>
+            <w:fldChar w:fldCharType="end"/>
+          </w:r>
+          <w:r>
+            <w:rPr>
+              <w:rtl w:val="0"/>
+            </w:rPr>
+          </w:r>
+        </w:p>
+        <w:p>
+          <w:pPr>
+            <w:widowControl w:val="0"/>
+            <w:tabs>
+              <w:tab w:val="right" w:leader="none" w:pos="9025.511811023624"/>
+            </w:tabs>
+            <w:spacing w:before="60" w:line="240" w:lineRule="auto"/>
+            <w:ind w:left="720" w:firstLine="0"/>
+            <w:jc w:val="left"/>
+            <w:rPr>
+              <w:color w:val="000000"/>
+              <w:u w:val="none"/>
+            </w:rPr>
+          </w:pPr>
+          <w:hyperlink w:anchor="_ehoz68g7lz">
+            <w:r>
+              <w:rPr>
+                <w:color w:val="000000"/>
+                <w:u w:val="none"/>
+                <w:rtl w:val="0"/>
+              </w:rPr>
+              <w:t xml:space="preserve">3.1.3. Stranice za pregled i manipulaciju događajima i rezervacijama</w:t>
+              <w:tab/>
+            </w:r>
+          </w:hyperlink>
+          <w:r>
+            <w:fldChar w:fldCharType="begin"/>
+            <w:instrText xml:space="preserve"> PAGEREF _ehoz68g7lz \h </w:instrText>
+            <w:fldChar w:fldCharType="separate"/>
+          </w:r>
+          <w:r>
+            <w:rPr>
+              <w:rtl w:val="0"/>
+            </w:rPr>
+            <w:t xml:space="preserve">9</w:t>
+          </w:r>
+          <w:r>
+            <w:fldChar w:fldCharType="end"/>
+          </w:r>
+          <w:r>
+            <w:rPr>
+              <w:rtl w:val="0"/>
+            </w:rPr>
+          </w:r>
+        </w:p>
+        <w:p>
+          <w:pPr>
+            <w:widowControl w:val="0"/>
+            <w:tabs>
+              <w:tab w:val="right" w:leader="none" w:pos="9025.511811023624"/>
+            </w:tabs>
+            <w:spacing w:before="60" w:line="240" w:lineRule="auto"/>
+            <w:ind w:left="720" w:firstLine="0"/>
+            <w:jc w:val="left"/>
+            <w:rPr>
+              <w:color w:val="000000"/>
+              <w:u w:val="none"/>
+            </w:rPr>
+          </w:pPr>
+          <w:hyperlink w:anchor="_o2pkhd6pg9k">
+            <w:r>
+              <w:rPr>
+                <w:color w:val="000000"/>
+                <w:u w:val="none"/>
+                <w:rtl w:val="0"/>
+              </w:rPr>
+              <w:t xml:space="preserve">3.1.4. Forme</w:t>
+              <w:tab/>
+            </w:r>
+          </w:hyperlink>
+          <w:r>
+            <w:fldChar w:fldCharType="begin"/>
+            <w:instrText xml:space="preserve"> PAGEREF _o2pkhd6pg9k \h </w:instrText>
+            <w:fldChar w:fldCharType="separate"/>
+          </w:r>
+          <w:r>
+            <w:rPr>
+              <w:rtl w:val="0"/>
+            </w:rPr>
+            <w:t xml:space="preserve">12</w:t>
+          </w:r>
+          <w:r>
+            <w:fldChar w:fldCharType="end"/>
+          </w:r>
+          <w:r>
+            <w:rPr>
+              <w:rtl w:val="0"/>
+            </w:rPr>
+          </w:r>
+        </w:p>
+        <w:p>
+          <w:pPr>
+            <w:widowControl w:val="0"/>
+            <w:tabs>
+              <w:tab w:val="right" w:leader="none" w:pos="9025.511811023624"/>
+            </w:tabs>
+            <w:spacing w:before="60" w:line="240" w:lineRule="auto"/>
+            <w:jc w:val="left"/>
+            <w:rPr>
+              <w:b w:val="1"/>
+              <w:bCs w:val="1"/>
+              <w:color w:val="000000"/>
+              <w:u w:val="none"/>
+            </w:rPr>
+          </w:pPr>
+          <w:hyperlink w:anchor="_bm1bupniiub8">
+            <w:r>
+              <w:rPr>
+                <w:b w:val="1"/>
+                <w:bCs w:val="1"/>
+                <w:color w:val="000000"/>
+                <w:u w:val="none"/>
+                <w:rtl w:val="0"/>
+              </w:rPr>
+              <w:t xml:space="preserve">4. Backend implementacija</w:t>
+              <w:tab/>
+            </w:r>
+          </w:hyperlink>
+          <w:r>
+            <w:fldChar w:fldCharType="begin"/>
+            <w:instrText xml:space="preserve"> PAGEREF _bm1bupniiub8 \h </w:instrText>
+            <w:fldChar w:fldCharType="separate"/>
+          </w:r>
+          <w:r>
+            <w:rPr>
+              <w:b w:val="1"/>
+              <w:bCs w:val="1"/>
+              <w:rtl w:val="0"/>
+            </w:rPr>
+            <w:t xml:space="preserve">14</w:t>
+          </w:r>
+          <w:r>
+            <w:fldChar w:fldCharType="end"/>
+          </w:r>
+          <w:r>
+            <w:rPr>
+              <w:rtl w:val="0"/>
+            </w:rPr>
+          </w:r>
+        </w:p>
+        <w:p>
+          <w:pPr>
+            <w:widowControl w:val="0"/>
+            <w:tabs>
+              <w:tab w:val="right" w:leader="none" w:pos="9025.511811023624"/>
+            </w:tabs>
+            <w:spacing w:before="60" w:line="240" w:lineRule="auto"/>
+            <w:ind w:left="360" w:firstLine="0"/>
+            <w:jc w:val="left"/>
+            <w:rPr>
+              <w:color w:val="000000"/>
+              <w:u w:val="none"/>
+            </w:rPr>
+          </w:pPr>
+          <w:hyperlink w:anchor="_wacfyv51syum">
+            <w:r>
+              <w:rPr>
+                <w:color w:val="000000"/>
+                <w:u w:val="none"/>
+                <w:rtl w:val="0"/>
+              </w:rPr>
+              <w:t xml:space="preserve">4.1. Arhitektura aplikacije</w:t>
+              <w:tab/>
+            </w:r>
+          </w:hyperlink>
+          <w:r>
+            <w:fldChar w:fldCharType="begin"/>
+            <w:instrText xml:space="preserve"> PAGEREF _wacfyv51syum \h </w:instrText>
+            <w:fldChar w:fldCharType="separate"/>
+          </w:r>
+          <w:r>
+            <w:rPr>
+              <w:rtl w:val="0"/>
+            </w:rPr>
+            <w:t xml:space="preserve">14</w:t>
+          </w:r>
+          <w:r>
+            <w:fldChar w:fldCharType="end"/>
+          </w:r>
+          <w:r>
+            <w:rPr>
+              <w:rtl w:val="0"/>
+            </w:rPr>
+          </w:r>
+        </w:p>
+        <w:p>
+          <w:pPr>
+            <w:widowControl w:val="0"/>
+            <w:tabs>
+              <w:tab w:val="right" w:leader="none" w:pos="9025.511811023624"/>
+            </w:tabs>
+            <w:spacing w:before="60" w:line="240" w:lineRule="auto"/>
+            <w:ind w:left="360" w:firstLine="0"/>
+            <w:jc w:val="left"/>
+            <w:rPr>
+              <w:color w:val="000000"/>
+              <w:u w:val="none"/>
+            </w:rPr>
+          </w:pPr>
+          <w:hyperlink w:anchor="_u5nk6cg1tam8">
+            <w:r>
+              <w:rPr>
+                <w:color w:val="000000"/>
+                <w:u w:val="none"/>
+                <w:rtl w:val="0"/>
+              </w:rPr>
+              <w:t xml:space="preserve">4.2. Sloj perzistencije</w:t>
+              <w:tab/>
+            </w:r>
+          </w:hyperlink>
+          <w:r>
+            <w:fldChar w:fldCharType="begin"/>
+            <w:instrText xml:space="preserve"> PAGEREF _u5nk6cg1tam8 \h </w:instrText>
+            <w:fldChar w:fldCharType="separate"/>
+          </w:r>
+          <w:r>
+            <w:rPr>
+              <w:rtl w:val="0"/>
+            </w:rPr>
+            <w:t xml:space="preserve">15</w:t>
+          </w:r>
+          <w:r>
+            <w:fldChar w:fldCharType="end"/>
+          </w:r>
+          <w:r>
+            <w:rPr>
+              <w:rtl w:val="0"/>
+            </w:rPr>
+          </w:r>
+        </w:p>
+        <w:p>
+          <w:pPr>
+            <w:widowControl w:val="0"/>
+            <w:tabs>
+              <w:tab w:val="right" w:leader="none" w:pos="9025.511811023624"/>
+            </w:tabs>
+            <w:spacing w:before="60" w:line="240" w:lineRule="auto"/>
+            <w:ind w:left="360" w:firstLine="0"/>
+            <w:jc w:val="left"/>
+            <w:rPr>
+              <w:color w:val="000000"/>
+              <w:u w:val="none"/>
+            </w:rPr>
+          </w:pPr>
+          <w:hyperlink w:anchor="_7yijsvoxh92e">
+            <w:r>
+              <w:rPr>
+                <w:color w:val="000000"/>
+                <w:u w:val="none"/>
+                <w:rtl w:val="0"/>
+              </w:rPr>
+              <w:t xml:space="preserve">4.3. Servisni sloj</w:t>
+              <w:tab/>
+            </w:r>
+          </w:hyperlink>
+          <w:r>
+            <w:fldChar w:fldCharType="begin"/>
+            <w:instrText xml:space="preserve"> PAGEREF _7yijsvoxh92e \h </w:instrText>
+            <w:fldChar w:fldCharType="separate"/>
+          </w:r>
+          <w:r>
+            <w:rPr>
+              <w:rtl w:val="0"/>
+            </w:rPr>
+            <w:t xml:space="preserve">17</w:t>
+          </w:r>
+          <w:r>
+            <w:fldChar w:fldCharType="end"/>
+          </w:r>
+          <w:r>
+            <w:rPr>
+              <w:rtl w:val="0"/>
+            </w:rPr>
+          </w:r>
+        </w:p>
+        <w:p>
+          <w:pPr>
+            <w:widowControl w:val="0"/>
+            <w:tabs>
+              <w:tab w:val="right" w:leader="none" w:pos="9025.511811023624"/>
+            </w:tabs>
+            <w:spacing w:before="60" w:line="240" w:lineRule="auto"/>
+            <w:ind w:left="360" w:firstLine="0"/>
+            <w:jc w:val="left"/>
+            <w:rPr>
+              <w:color w:val="000000"/>
+              <w:u w:val="none"/>
+            </w:rPr>
+          </w:pPr>
+          <w:hyperlink w:anchor="_54vv7pdjqu4f">
+            <w:r>
+              <w:rPr>
+                <w:color w:val="000000"/>
+                <w:u w:val="none"/>
+                <w:rtl w:val="0"/>
+              </w:rPr>
+              <w:t xml:space="preserve">4.4. Kontrolerski sloj</w:t>
+              <w:tab/>
+            </w:r>
+          </w:hyperlink>
+          <w:r>
+            <w:fldChar w:fldCharType="begin"/>
+            <w:instrText xml:space="preserve"> PAGEREF _54vv7pdjqu4f \h </w:instrText>
+            <w:fldChar w:fldCharType="separate"/>
+          </w:r>
+          <w:r>
+            <w:rPr>
+              <w:rtl w:val="0"/>
+            </w:rPr>
+            <w:t xml:space="preserve">20</w:t>
+          </w:r>
+          <w:r>
+            <w:fldChar w:fldCharType="end"/>
+          </w:r>
+          <w:r>
+            <w:rPr>
+              <w:rtl w:val="0"/>
+            </w:rPr>
+          </w:r>
+        </w:p>
+        <w:p>
+          <w:pPr>
+            <w:widowControl w:val="0"/>
+            <w:tabs>
+              <w:tab w:val="right" w:leader="none" w:pos="9025.511811023624"/>
+            </w:tabs>
+            <w:spacing w:before="60" w:line="240" w:lineRule="auto"/>
+            <w:jc w:val="left"/>
+            <w:rPr>
+              <w:b w:val="1"/>
+              <w:bCs w:val="1"/>
+              <w:color w:val="000000"/>
+              <w:u w:val="none"/>
+            </w:rPr>
+          </w:pPr>
+          <w:hyperlink w:anchor="_t03ilgebu7u7">
+            <w:r>
+              <w:rPr>
+                <w:b w:val="1"/>
+                <w:bCs w:val="1"/>
+                <w:color w:val="000000"/>
+                <w:u w:val="none"/>
+                <w:rtl w:val="0"/>
+              </w:rPr>
+              <w:t xml:space="preserve">5. Zaključak</w:t>
+              <w:tab/>
+            </w:r>
+          </w:hyperlink>
+          <w:r>
+            <w:fldChar w:fldCharType="begin"/>
+            <w:instrText xml:space="preserve"> PAGEREF _t03ilgebu7u7 \h </w:instrText>
+            <w:fldChar w:fldCharType="separate"/>
+          </w:r>
+          <w:r>
+            <w:rPr>
+              <w:b w:val="1"/>
+              <w:bCs w:val="1"/>
+              <w:rtl w:val="0"/>
+            </w:rPr>
+            <w:t xml:space="preserve">22</w:t>
+          </w:r>
+          <w:r>
+            <w:fldChar w:fldCharType="end"/>
+          </w:r>
+          <w:r>
+            <w:rPr>
+              <w:rtl w:val="0"/>
+            </w:rPr>
+          </w:r>
+          <w:r>
+            <w:fldChar w:fldCharType="end"/>
+          </w:r>
+        </w:p>
+      </w:sdtContent>
+    </w:sdt>
+    <w:p>
+      <w:pPr>
+        <w:pBdr>
+          <w:top w:color="auto" w:space="0" w:sz="0" w:val="none"/>
+          <w:left w:color="auto" w:space="0" w:sz="0" w:val="none"/>
+          <w:bottom w:color="auto" w:space="0" w:sz="0" w:val="none"/>
+          <w:right w:color="auto" w:space="0" w:sz="0" w:val="none"/>
+          <w:between w:color="auto" w:space="0" w:sz="0" w:val="none"/>
+        </w:pBdr>
+        <w:shd w:fill="ffffff" w:val="clear"/>
+        <w:spacing w:before="200" w:lineRule="auto"/>
+        <w:jc w:val="both"/>
+        <w:rPr>
+          <w:b w:val="1"/>
+          <w:bCs w:val="1"/>
+          <w:sz w:val="28"/>
+          <w:szCs w:val="28"/>
+        </w:rPr>
         <w:sectPr>
           <w:pgSz w:h="16834" w:w="11909" w:orient="portrait"/>
           <w:pgMar w:bottom="1440" w:top="1440" w:left="1440" w:right="1440" w:header="720" w:footer="720"/>
@@ -670,14 +1465,8 @@
       </w:pPr>
       <w:r>
         <w:rPr>
-          <w:rFonts w:ascii="Times New Roman" w:cs="Times New Roman" w:eastAsia="Times New Roman" w:hAnsi="Times New Roman"/>
-          <w:b w:val="1"/>
-          <w:bCs w:val="1"/>
-          <w:sz w:val="28"/>
-          <w:szCs w:val="28"/>
-          <w:rtl w:val="0"/>
-        </w:rPr>
-        <w:t xml:space="preserve">Sadržaj</w:t>
+          <w:rtl w:val="0"/>
+        </w:rPr>
       </w:r>
     </w:p>
     <w:p>
@@ -945,12 +1734,12 @@
           <wp:inline distB="114300" distT="114300" distL="114300" distR="114300">
             <wp:extent cx="5670550" cy="3622599"/>
             <wp:effectExtent b="0" l="0" r="0" t="0"/>
-            <wp:docPr id="12" name="image6.png"/>
+            <wp:docPr id="12" name="image7.png"/>
             <a:graphic>
               <a:graphicData uri="http://schemas.openxmlformats.org/drawingml/2006/picture">
                 <pic:pic>
                   <pic:nvPicPr>
-                    <pic:cNvPr id="0" name="image6.png"/>
+                    <pic:cNvPr id="0" name="image7.png"/>
                     <pic:cNvPicPr preferRelativeResize="0"/>
                   </pic:nvPicPr>
                   <pic:blipFill>
@@ -1220,12 +2009,12 @@
           <wp:inline distB="114300" distT="114300" distL="114300" distR="114300">
             <wp:extent cx="5656792" cy="6019800"/>
             <wp:effectExtent b="0" l="0" r="0" t="0"/>
-            <wp:docPr id="8" name="image9.png"/>
+            <wp:docPr id="8" name="image5.png"/>
             <a:graphic>
               <a:graphicData uri="http://schemas.openxmlformats.org/drawingml/2006/picture">
                 <pic:pic>
                   <pic:nvPicPr>
-                    <pic:cNvPr id="0" name="image9.png"/>
+                    <pic:cNvPr id="0" name="image5.png"/>
                     <pic:cNvPicPr preferRelativeResize="0"/>
                   </pic:nvPicPr>
                   <pic:blipFill>
@@ -1426,12 +2215,12 @@
           <wp:inline distB="114300" distT="114300" distL="114300" distR="114300">
             <wp:extent cx="5731200" cy="6045200"/>
             <wp:effectExtent b="0" l="0" r="0" t="0"/>
-            <wp:docPr id="5" name="image19.png"/>
+            <wp:docPr id="5" name="image21.png"/>
             <a:graphic>
               <a:graphicData uri="http://schemas.openxmlformats.org/drawingml/2006/picture">
                 <pic:pic>
                   <pic:nvPicPr>
-                    <pic:cNvPr id="0" name="image19.png"/>
+                    <pic:cNvPr id="0" name="image21.png"/>
                     <pic:cNvPicPr preferRelativeResize="0"/>
                   </pic:nvPicPr>
                   <pic:blipFill>
@@ -1493,12 +2282,12 @@
           <wp:inline distB="114300" distT="114300" distL="114300" distR="114300">
             <wp:extent cx="5731200" cy="6045200"/>
             <wp:effectExtent b="0" l="0" r="0" t="0"/>
-            <wp:docPr id="10" name="image15.png"/>
+            <wp:docPr id="10" name="image16.png"/>
             <a:graphic>
               <a:graphicData uri="http://schemas.openxmlformats.org/drawingml/2006/picture">
                 <pic:pic>
                   <pic:nvPicPr>
-                    <pic:cNvPr id="0" name="image15.png"/>
+                    <pic:cNvPr id="0" name="image16.png"/>
                     <pic:cNvPicPr preferRelativeResize="0"/>
                   </pic:nvPicPr>
                   <pic:blipFill>
@@ -1560,12 +2349,12 @@
           <wp:inline distB="114300" distT="114300" distL="114300" distR="114300">
             <wp:extent cx="5529400" cy="5829300"/>
             <wp:effectExtent b="0" l="0" r="0" t="0"/>
-            <wp:docPr id="2" name="image21.png"/>
+            <wp:docPr id="2" name="image2.png"/>
             <a:graphic>
               <a:graphicData uri="http://schemas.openxmlformats.org/drawingml/2006/picture">
                 <pic:pic>
                   <pic:nvPicPr>
-                    <pic:cNvPr id="0" name="image21.png"/>
+                    <pic:cNvPr id="0" name="image2.png"/>
                     <pic:cNvPicPr preferRelativeResize="0"/>
                   </pic:nvPicPr>
                   <pic:blipFill>
@@ -1753,12 +2542,12 @@
           <wp:inline distB="114300" distT="114300" distL="114300" distR="114300">
             <wp:extent cx="5731200" cy="6007100"/>
             <wp:effectExtent b="0" l="0" r="0" t="0"/>
-            <wp:docPr id="20" name="image22.png"/>
+            <wp:docPr id="20" name="image15.png"/>
             <a:graphic>
               <a:graphicData uri="http://schemas.openxmlformats.org/drawingml/2006/picture">
                 <pic:pic>
                   <pic:nvPicPr>
-                    <pic:cNvPr id="0" name="image22.png"/>
+                    <pic:cNvPr id="0" name="image15.png"/>
                     <pic:cNvPicPr preferRelativeResize="0"/>
                   </pic:nvPicPr>
                   <pic:blipFill>
@@ -2018,12 +2807,12 @@
           <wp:inline distB="114300" distT="114300" distL="114300" distR="114300">
             <wp:extent cx="5133975" cy="5343525"/>
             <wp:effectExtent b="0" l="0" r="0" t="0"/>
-            <wp:docPr id="19" name="image20.png"/>
+            <wp:docPr id="19" name="image14.png"/>
             <a:graphic>
               <a:graphicData uri="http://schemas.openxmlformats.org/drawingml/2006/picture">
                 <pic:pic>
                   <pic:nvPicPr>
-                    <pic:cNvPr id="0" name="image20.png"/>
+                    <pic:cNvPr id="0" name="image14.png"/>
                     <pic:cNvPicPr preferRelativeResize="0"/>
                   </pic:nvPicPr>
                   <pic:blipFill>
@@ -2256,12 +3045,12 @@
           <wp:inline distB="114300" distT="114300" distL="114300" distR="114300">
             <wp:extent cx="5731200" cy="4013200"/>
             <wp:effectExtent b="0" l="0" r="0" t="0"/>
-            <wp:docPr id="17" name="image16.png"/>
+            <wp:docPr id="17" name="image9.png"/>
             <a:graphic>
               <a:graphicData uri="http://schemas.openxmlformats.org/drawingml/2006/picture">
                 <pic:pic>
                   <pic:nvPicPr>
-                    <pic:cNvPr id="0" name="image16.png"/>
+                    <pic:cNvPr id="0" name="image9.png"/>
                     <pic:cNvPicPr preferRelativeResize="0"/>
                   </pic:nvPicPr>
                   <pic:blipFill>
@@ -2361,12 +3150,12 @@
           <wp:inline distB="114300" distT="114300" distL="114300" distR="114300">
             <wp:extent cx="5731200" cy="3073400"/>
             <wp:effectExtent b="0" l="0" r="0" t="0"/>
-            <wp:docPr id="16" name="image14.png"/>
+            <wp:docPr id="16" name="image3.png"/>
             <a:graphic>
               <a:graphicData uri="http://schemas.openxmlformats.org/drawingml/2006/picture">
                 <pic:pic>
                   <pic:nvPicPr>
-                    <pic:cNvPr id="0" name="image14.png"/>
+                    <pic:cNvPr id="0" name="image3.png"/>
                     <pic:cNvPicPr preferRelativeResize="0"/>
                   </pic:nvPicPr>
                   <pic:blipFill>
@@ -2571,12 +3360,12 @@
           <wp:inline distB="114300" distT="114300" distL="114300" distR="114300">
             <wp:extent cx="5731200" cy="3479800"/>
             <wp:effectExtent b="0" l="0" r="0" t="0"/>
-            <wp:docPr id="6" name="image11.png"/>
+            <wp:docPr id="6" name="image8.png"/>
             <a:graphic>
               <a:graphicData uri="http://schemas.openxmlformats.org/drawingml/2006/picture">
                 <pic:pic>
                   <pic:nvPicPr>
-                    <pic:cNvPr id="0" name="image11.png"/>
+                    <pic:cNvPr id="0" name="image8.png"/>
                     <pic:cNvPicPr preferRelativeResize="0"/>
                   </pic:nvPicPr>
                   <pic:blipFill>
@@ -2815,12 +3604,12 @@
           <wp:inline distB="114300" distT="114300" distL="114300" distR="114300">
             <wp:extent cx="5731200" cy="4660900"/>
             <wp:effectExtent b="0" l="0" r="0" t="0"/>
-            <wp:docPr id="3" name="image4.png"/>
+            <wp:docPr id="3" name="image1.png"/>
             <a:graphic>
               <a:graphicData uri="http://schemas.openxmlformats.org/drawingml/2006/picture">
                 <pic:pic>
                   <pic:nvPicPr>
-                    <pic:cNvPr id="0" name="image4.png"/>
+                    <pic:cNvPr id="0" name="image1.png"/>
                     <pic:cNvPicPr preferRelativeResize="0"/>
                   </pic:nvPicPr>
                   <pic:blipFill>
@@ -2881,12 +3670,12 @@
           <wp:inline distB="114300" distT="114300" distL="114300" distR="114300">
             <wp:extent cx="5731200" cy="1981200"/>
             <wp:effectExtent b="0" l="0" r="0" t="0"/>
-            <wp:docPr id="1" name="image12.png"/>
+            <wp:docPr id="1" name="image22.png"/>
             <a:graphic>
               <a:graphicData uri="http://schemas.openxmlformats.org/drawingml/2006/picture">
                 <pic:pic>
                   <pic:nvPicPr>
-                    <pic:cNvPr id="0" name="image12.png"/>
+                    <pic:cNvPr id="0" name="image22.png"/>
                     <pic:cNvPicPr preferRelativeResize="0"/>
                   </pic:nvPicPr>
                   <pic:blipFill>
@@ -2947,12 +3736,12 @@
           <wp:inline distB="114300" distT="114300" distL="114300" distR="114300">
             <wp:extent cx="5731200" cy="2197100"/>
             <wp:effectExtent b="0" l="0" r="0" t="0"/>
-            <wp:docPr id="9" name="image3.png"/>
+            <wp:docPr id="9" name="image11.png"/>
             <a:graphic>
               <a:graphicData uri="http://schemas.openxmlformats.org/drawingml/2006/picture">
                 <pic:pic>
                   <pic:nvPicPr>
-                    <pic:cNvPr id="0" name="image3.png"/>
+                    <pic:cNvPr id="0" name="image11.png"/>
                     <pic:cNvPicPr preferRelativeResize="0"/>
                   </pic:nvPicPr>
                   <pic:blipFill>
@@ -3013,12 +3802,12 @@
           <wp:inline distB="114300" distT="114300" distL="114300" distR="114300">
             <wp:extent cx="5731200" cy="3035300"/>
             <wp:effectExtent b="0" l="0" r="0" t="0"/>
-            <wp:docPr id="11" name="image2.png"/>
+            <wp:docPr id="11" name="image13.png"/>
             <a:graphic>
               <a:graphicData uri="http://schemas.openxmlformats.org/drawingml/2006/picture">
                 <pic:pic>
                   <pic:nvPicPr>
-                    <pic:cNvPr id="0" name="image2.png"/>
+                    <pic:cNvPr id="0" name="image13.png"/>
                     <pic:cNvPicPr preferRelativeResize="0"/>
                   </pic:nvPicPr>
                   <pic:blipFill>
@@ -3360,12 +4149,12 @@
           <wp:inline distB="114300" distT="114300" distL="114300" distR="114300">
             <wp:extent cx="5731200" cy="3670300"/>
             <wp:effectExtent b="0" l="0" r="0" t="0"/>
-            <wp:docPr id="13" name="image1.png"/>
+            <wp:docPr id="13" name="image4.png"/>
             <a:graphic>
               <a:graphicData uri="http://schemas.openxmlformats.org/drawingml/2006/picture">
                 <pic:pic>
                   <pic:nvPicPr>
-                    <pic:cNvPr id="0" name="image1.png"/>
+                    <pic:cNvPr id="0" name="image4.png"/>
                     <pic:cNvPicPr preferRelativeResize="0"/>
                   </pic:nvPicPr>
                   <pic:blipFill>
@@ -3427,12 +4216,12 @@
           <wp:inline distB="114300" distT="114300" distL="114300" distR="114300">
             <wp:extent cx="5498111" cy="2881313"/>
             <wp:effectExtent b="0" l="0" r="0" t="0"/>
-            <wp:docPr id="21" name="image13.png"/>
+            <wp:docPr id="21" name="image19.png"/>
             <a:graphic>
               <a:graphicData uri="http://schemas.openxmlformats.org/drawingml/2006/picture">
                 <pic:pic>
                   <pic:nvPicPr>
-                    <pic:cNvPr id="0" name="image13.png"/>
+                    <pic:cNvPr id="0" name="image19.png"/>
                     <pic:cNvPicPr preferRelativeResize="0"/>
                   </pic:nvPicPr>
                   <pic:blipFill>
@@ -3494,12 +4283,12 @@
           <wp:inline distB="114300" distT="114300" distL="114300" distR="114300">
             <wp:extent cx="5378288" cy="3247443"/>
             <wp:effectExtent b="0" l="0" r="0" t="0"/>
-            <wp:docPr id="4" name="image7.png"/>
+            <wp:docPr id="4" name="image20.png"/>
             <a:graphic>
               <a:graphicData uri="http://schemas.openxmlformats.org/drawingml/2006/picture">
                 <pic:pic>
                   <pic:nvPicPr>
-                    <pic:cNvPr id="0" name="image7.png"/>
+                    <pic:cNvPr id="0" name="image20.png"/>
                     <pic:cNvPicPr preferRelativeResize="0"/>
                   </pic:nvPicPr>
                   <pic:blipFill>
@@ -3560,12 +4349,12 @@
           <wp:inline distB="114300" distT="114300" distL="114300" distR="114300">
             <wp:extent cx="5538788" cy="1435300"/>
             <wp:effectExtent b="0" l="0" r="0" t="0"/>
-            <wp:docPr id="14" name="image5.png"/>
+            <wp:docPr id="14" name="image6.png"/>
             <a:graphic>
               <a:graphicData uri="http://schemas.openxmlformats.org/drawingml/2006/picture">
                 <pic:pic>
                   <pic:nvPicPr>
-                    <pic:cNvPr id="0" name="image5.png"/>
+                    <pic:cNvPr id="0" name="image6.png"/>
                     <pic:cNvPicPr preferRelativeResize="0"/>
                   </pic:nvPicPr>
                   <pic:blipFill>

</xml_diff>